<commit_message>
Se cambio la plantilla de Wrod con las variables correctas.
</commit_message>
<xml_diff>
--- a/backend/templates/plantilla_manera2.docx
+++ b/backend/templates/plantilla_manera2.docx
@@ -3175,13 +3175,59 @@
         </w:rPr>
         <w:t xml:space="preserve">a </w:t>
       </w:r>
-      <w:r>
-        <w:rPr>
-          <w:rFonts w:ascii="Arial" w:hAnsi="Arial" w:cs="Arial"/>
-          <w:sz w:val="14"/>
-          <w:szCs w:val="14"/>
-        </w:rPr>
-        <w:t>{{ FECHA_DE_EXPEDICION }}</w:t>
+      <w:proofErr w:type="gramStart"/>
+      <w:r>
+        <w:rPr>
+          <w:rFonts w:ascii="Arial" w:hAnsi="Arial" w:cs="Arial"/>
+          <w:sz w:val="14"/>
+          <w:szCs w:val="14"/>
+        </w:rPr>
+        <w:t xml:space="preserve">{{ </w:t>
+      </w:r>
+      <w:proofErr w:type="spellStart"/>
+      <w:r>
+        <w:rPr>
+          <w:rFonts w:ascii="Arial" w:hAnsi="Arial" w:cs="Arial"/>
+          <w:sz w:val="14"/>
+          <w:szCs w:val="14"/>
+        </w:rPr>
+        <w:t>fecha</w:t>
+      </w:r>
+      <w:proofErr w:type="gramEnd"/>
+      <w:r>
+        <w:rPr>
+          <w:rFonts w:ascii="Arial" w:hAnsi="Arial" w:cs="Arial"/>
+          <w:sz w:val="14"/>
+          <w:szCs w:val="14"/>
+        </w:rPr>
+        <w:t>_</w:t>
+      </w:r>
+      <w:proofErr w:type="gramStart"/>
+      <w:r>
+        <w:rPr>
+          <w:rFonts w:ascii="Arial" w:hAnsi="Arial" w:cs="Arial"/>
+          <w:sz w:val="14"/>
+          <w:szCs w:val="14"/>
+        </w:rPr>
+        <w:t>expedicion</w:t>
+      </w:r>
+      <w:proofErr w:type="spellEnd"/>
+      <w:r>
+        <w:rPr>
+          <w:rFonts w:ascii="Arial" w:hAnsi="Arial" w:cs="Arial"/>
+          <w:sz w:val="14"/>
+          <w:szCs w:val="14"/>
+        </w:rPr>
+        <w:t xml:space="preserve"> }</w:t>
+      </w:r>
+      <w:proofErr w:type="gramEnd"/>
+      <w:r>
+        <w:rPr>
+          <w:rFonts w:ascii="Arial" w:hAnsi="Arial" w:cs="Arial"/>
+          <w:sz w:val="14"/>
+          <w:szCs w:val="14"/>
+        </w:rPr>
+        <w:t>}</w:t>
       </w:r>
       <w:r>
         <w:rPr>
@@ -3234,6 +3280,7 @@
         <w:t xml:space="preserve"> </w:t>
       </w:r>
       <w:bookmarkEnd w:id="5"/>
+      <w:proofErr w:type="gramStart"/>
       <w:r>
         <w:rPr>
           <w:rFonts w:ascii="Arial" w:hAnsi="Arial" w:cs="Arial"/>
@@ -3253,7 +3300,29 @@
           <w:sz w:val="14"/>
           <w:szCs w:val="14"/>
         </w:rPr>
-        <w:t>numero_carta</w:t>
+        <w:t>numero</w:t>
+      </w:r>
+      <w:proofErr w:type="gramEnd"/>
+      <w:r>
+        <w:rPr>
+          <w:rFonts w:ascii="Arial" w:hAnsi="Arial" w:cs="Arial"/>
+          <w:b/>
+          <w:bCs/>
+          <w:sz w:val="14"/>
+          <w:szCs w:val="14"/>
+        </w:rPr>
+        <w:t>_</w:t>
+      </w:r>
+      <w:proofErr w:type="gramStart"/>
+      <w:r>
+        <w:rPr>
+          <w:rFonts w:ascii="Arial" w:hAnsi="Arial" w:cs="Arial"/>
+          <w:b/>
+          <w:bCs/>
+          <w:sz w:val="14"/>
+          <w:szCs w:val="14"/>
+        </w:rPr>
+        <w:t>carta</w:t>
       </w:r>
       <w:proofErr w:type="spellEnd"/>
       <w:r>
@@ -3264,7 +3333,18 @@
           <w:sz w:val="14"/>
           <w:szCs w:val="14"/>
         </w:rPr>
-        <w:t xml:space="preserve"> }}</w:t>
+        <w:t xml:space="preserve"> }</w:t>
+      </w:r>
+      <w:proofErr w:type="gramEnd"/>
+      <w:r>
+        <w:rPr>
+          <w:rFonts w:ascii="Arial" w:hAnsi="Arial" w:cs="Arial"/>
+          <w:b/>
+          <w:bCs/>
+          <w:sz w:val="14"/>
+          <w:szCs w:val="14"/>
+        </w:rPr>
+        <w:t>}</w:t>
       </w:r>
       <w:r>
         <w:rPr>
@@ -3422,6 +3502,7 @@
         </w:rPr>
         <w:t xml:space="preserve"> </w:t>
       </w:r>
+      <w:proofErr w:type="gramStart"/>
       <w:r>
         <w:rPr>
           <w:rFonts w:ascii="Arial" w:hAnsi="Arial" w:cs="Arial"/>
@@ -3441,7 +3522,29 @@
           <w:sz w:val="14"/>
           <w:szCs w:val="14"/>
         </w:rPr>
-        <w:t>fecha_liquidacion</w:t>
+        <w:t>fecha</w:t>
+      </w:r>
+      <w:proofErr w:type="gramEnd"/>
+      <w:r>
+        <w:rPr>
+          <w:rFonts w:ascii="Arial" w:hAnsi="Arial" w:cs="Arial"/>
+          <w:b/>
+          <w:bCs/>
+          <w:sz w:val="14"/>
+          <w:szCs w:val="14"/>
+        </w:rPr>
+        <w:t>_</w:t>
+      </w:r>
+      <w:proofErr w:type="gramStart"/>
+      <w:r>
+        <w:rPr>
+          <w:rFonts w:ascii="Arial" w:hAnsi="Arial" w:cs="Arial"/>
+          <w:b/>
+          <w:bCs/>
+          <w:sz w:val="14"/>
+          <w:szCs w:val="14"/>
+        </w:rPr>
+        <w:t>liquidacion</w:t>
       </w:r>
       <w:proofErr w:type="spellEnd"/>
       <w:r>
@@ -3452,7 +3555,18 @@
           <w:sz w:val="14"/>
           <w:szCs w:val="14"/>
         </w:rPr>
-        <w:t xml:space="preserve"> }}</w:t>
+        <w:t xml:space="preserve"> }</w:t>
+      </w:r>
+      <w:proofErr w:type="gramEnd"/>
+      <w:r>
+        <w:rPr>
+          <w:rFonts w:ascii="Arial" w:hAnsi="Arial" w:cs="Arial"/>
+          <w:b/>
+          <w:bCs/>
+          <w:sz w:val="14"/>
+          <w:szCs w:val="14"/>
+        </w:rPr>
+        <w:t>}</w:t>
       </w:r>
     </w:p>
     <w:p>

</xml_diff>

<commit_message>
Se agregaron variables a extraer en el sistema.
</commit_message>
<xml_diff>
--- a/backend/templates/plantilla_manera2.docx
+++ b/backend/templates/plantilla_manera2.docx
@@ -549,7 +549,6 @@
         </w:rPr>
         <w:t xml:space="preserve">A FAVOR DE LA SEÑORA </w:t>
       </w:r>
-      <w:proofErr w:type="gramStart"/>
       <w:r>
         <w:rPr>
           <w:rFonts w:ascii="Arial" w:hAnsi="Arial" w:cs="Arial"/>
@@ -558,40 +557,7 @@
           <w:szCs w:val="14"/>
           <w:lang w:val="es-MX"/>
         </w:rPr>
-        <w:t>{{ nombre</w:t>
-      </w:r>
-      <w:proofErr w:type="gramEnd"/>
-      <w:r>
-        <w:rPr>
-          <w:rFonts w:ascii="Arial" w:hAnsi="Arial" w:cs="Arial"/>
-          <w:b/>
-          <w:sz w:val="14"/>
-          <w:szCs w:val="14"/>
-          <w:lang w:val="es-MX"/>
-        </w:rPr>
-        <w:t>_</w:t>
-      </w:r>
-      <w:proofErr w:type="gramStart"/>
-      <w:r>
-        <w:rPr>
-          <w:rFonts w:ascii="Arial" w:hAnsi="Arial" w:cs="Arial"/>
-          <w:b/>
-          <w:sz w:val="14"/>
-          <w:szCs w:val="14"/>
-          <w:lang w:val="es-MX"/>
-        </w:rPr>
-        <w:t>acreditado }</w:t>
-      </w:r>
-      <w:proofErr w:type="gramEnd"/>
-      <w:r>
-        <w:rPr>
-          <w:rFonts w:ascii="Arial" w:hAnsi="Arial" w:cs="Arial"/>
-          <w:b/>
-          <w:sz w:val="14"/>
-          <w:szCs w:val="14"/>
-          <w:lang w:val="es-MX"/>
-        </w:rPr>
-        <w:t>}</w:t>
+        <w:t>{{ nombre_acreditado }}</w:t>
       </w:r>
       <w:r>
         <w:rPr>
@@ -1424,7 +1390,6 @@
         </w:rPr>
         <w:t xml:space="preserve"> </w:t>
       </w:r>
-      <w:proofErr w:type="gramStart"/>
       <w:r>
         <w:rPr>
           <w:rFonts w:ascii="Arial" w:eastAsia="Batang" w:hAnsi="Arial" w:cs="Arial"/>
@@ -1434,43 +1399,66 @@
           <w:szCs w:val="14"/>
           <w:lang w:val="es-MX"/>
         </w:rPr>
-        <w:t>{{ numero</w:t>
-      </w:r>
-      <w:proofErr w:type="gramEnd"/>
-      <w:r>
-        <w:rPr>
-          <w:rFonts w:ascii="Arial" w:eastAsia="Batang" w:hAnsi="Arial" w:cs="Arial"/>
-          <w:b/>
-          <w:bCs/>
+        <w:t>{{ numero_carta }}</w:t>
+      </w:r>
+      <w:r>
+        <w:rPr>
+          <w:rFonts w:ascii="Arial" w:eastAsia="Batang" w:hAnsi="Arial" w:cs="Arial"/>
+          <w:sz w:val="14"/>
+          <w:szCs w:val="14"/>
+        </w:rPr>
+        <w:t>,</w:t>
+      </w:r>
+      <w:r>
+        <w:rPr>
+          <w:rFonts w:ascii="Arial" w:eastAsia="Batang" w:hAnsi="Arial" w:cs="Arial"/>
+          <w:sz w:val="14"/>
+          <w:szCs w:val="14"/>
+        </w:rPr>
+        <w:t xml:space="preserve"> </w:t>
+      </w:r>
+      <w:r>
+        <w:rPr>
+          <w:rFonts w:ascii="Arial" w:eastAsia="Batang" w:hAnsi="Arial" w:cs="Arial"/>
+          <w:sz w:val="14"/>
+          <w:szCs w:val="14"/>
+        </w:rPr>
+        <w:t>de fecha</w:t>
+      </w:r>
+      <w:r>
+        <w:rPr>
+          <w:rFonts w:ascii="Arial" w:eastAsia="Batang" w:hAnsi="Arial" w:cs="Arial"/>
+          <w:sz w:val="14"/>
+          <w:szCs w:val="14"/>
+        </w:rPr>
+        <w:t xml:space="preserve"> </w:t>
+      </w:r>
+      <w:r>
+        <w:rPr>
+          <w:rFonts w:ascii="Arial" w:eastAsia="Batang" w:hAnsi="Arial" w:cs="Arial"/>
           <w:sz w:val="14"/>
           <w:szCs w:val="14"/>
           <w:lang w:val="es-MX"/>
         </w:rPr>
-        <w:t>_</w:t>
-      </w:r>
-      <w:proofErr w:type="gramStart"/>
-      <w:r>
-        <w:rPr>
-          <w:rFonts w:ascii="Arial" w:eastAsia="Batang" w:hAnsi="Arial" w:cs="Arial"/>
-          <w:b/>
-          <w:bCs/>
+        <w:t>{{ fecha</w:t>
+      </w:r>
+      <w:r>
+        <w:rPr>
+          <w:rFonts w:ascii="Arial" w:eastAsia="Batang" w:hAnsi="Arial" w:cs="Arial"/>
           <w:sz w:val="14"/>
           <w:szCs w:val="14"/>
           <w:lang w:val="es-MX"/>
         </w:rPr>
-        <w:t>carta }</w:t>
-      </w:r>
-      <w:proofErr w:type="gramEnd"/>
-      <w:r>
-        <w:rPr>
-          <w:rFonts w:ascii="Arial" w:eastAsia="Batang" w:hAnsi="Arial" w:cs="Arial"/>
-          <w:b/>
-          <w:bCs/>
+        <w:t>_expedicion</w:t>
+      </w:r>
+      <w:r>
+        <w:rPr>
+          <w:rFonts w:ascii="Arial" w:eastAsia="Batang" w:hAnsi="Arial" w:cs="Arial"/>
           <w:sz w:val="14"/>
           <w:szCs w:val="14"/>
           <w:lang w:val="es-MX"/>
         </w:rPr>
-        <w:t>}</w:t>
+        <w:t xml:space="preserve"> }}</w:t>
       </w:r>
       <w:r>
         <w:rPr>
@@ -1480,479 +1468,443 @@
         </w:rPr>
         <w:t>,</w:t>
       </w:r>
-      <w:r>
-        <w:rPr>
-          <w:rFonts w:ascii="Arial" w:eastAsia="Batang" w:hAnsi="Arial" w:cs="Arial"/>
-          <w:sz w:val="14"/>
-          <w:szCs w:val="14"/>
-        </w:rPr>
-        <w:t xml:space="preserve"> </w:t>
-      </w:r>
-      <w:r>
-        <w:rPr>
-          <w:rFonts w:ascii="Arial" w:eastAsia="Batang" w:hAnsi="Arial" w:cs="Arial"/>
-          <w:sz w:val="14"/>
-          <w:szCs w:val="14"/>
-        </w:rPr>
-        <w:t>de fecha</w:t>
-      </w:r>
-      <w:r>
-        <w:rPr>
-          <w:rFonts w:ascii="Arial" w:eastAsia="Batang" w:hAnsi="Arial" w:cs="Arial"/>
-          <w:sz w:val="14"/>
-          <w:szCs w:val="14"/>
-        </w:rPr>
-        <w:t xml:space="preserve"> </w:t>
-      </w:r>
-      <w:proofErr w:type="gramStart"/>
-      <w:r>
-        <w:rPr>
-          <w:rFonts w:ascii="Arial" w:eastAsia="Batang" w:hAnsi="Arial" w:cs="Arial"/>
+      <w:bookmarkStart w:id="4" w:name="_Hlk150194100"/>
+      <w:r>
+        <w:rPr>
+          <w:rFonts w:ascii="Arial" w:eastAsia="Batang" w:hAnsi="Arial" w:cs="Arial"/>
+          <w:sz w:val="14"/>
+          <w:szCs w:val="14"/>
+        </w:rPr>
+        <w:t xml:space="preserve"> </w:t>
+      </w:r>
+      <w:r>
+        <w:rPr>
+          <w:rFonts w:ascii="Arial" w:eastAsia="Batang" w:hAnsi="Arial" w:cs="Arial"/>
+          <w:sz w:val="14"/>
+          <w:szCs w:val="14"/>
+          <w:lang w:val="es-ES"/>
+        </w:rPr>
+        <w:t>otorgado ante</w:t>
+      </w:r>
+      <w:bookmarkEnd w:id="4"/>
+      <w:r>
+        <w:rPr>
+          <w:rFonts w:ascii="Arial" w:eastAsia="Batang" w:hAnsi="Arial" w:cs="Arial"/>
+          <w:sz w:val="14"/>
+          <w:szCs w:val="14"/>
+          <w:lang w:val="es-ES"/>
+        </w:rPr>
+        <w:t xml:space="preserve"> la fe del Licenciado</w:t>
+      </w:r>
+      <w:r>
+        <w:rPr>
+          <w:rFonts w:ascii="Arial" w:eastAsia="Batang" w:hAnsi="Arial" w:cs="Arial"/>
+          <w:sz w:val="14"/>
+          <w:szCs w:val="14"/>
+          <w:lang w:val="es-ES"/>
+        </w:rPr>
+        <w:t xml:space="preserve"> </w:t>
+      </w:r>
+      <w:r>
+        <w:rPr>
+          <w:rFonts w:ascii="Arial" w:eastAsia="Batang" w:hAnsi="Arial" w:cs="Arial"/>
+          <w:bCs/>
           <w:sz w:val="14"/>
           <w:szCs w:val="14"/>
           <w:lang w:val="es-MX"/>
         </w:rPr>
-        <w:t>{{ fecha</w:t>
-      </w:r>
-      <w:proofErr w:type="gramEnd"/>
-      <w:r>
-        <w:rPr>
-          <w:rFonts w:ascii="Arial" w:eastAsia="Batang" w:hAnsi="Arial" w:cs="Arial"/>
+        <w:t>{{ nombre_notario }}</w:t>
+      </w:r>
+      <w:r>
+        <w:rPr>
+          <w:rFonts w:ascii="Arial" w:eastAsia="Batang" w:hAnsi="Arial" w:cs="Arial"/>
+          <w:sz w:val="14"/>
+          <w:szCs w:val="14"/>
+        </w:rPr>
+        <w:t>,</w:t>
+      </w:r>
+      <w:r>
+        <w:rPr>
+          <w:rFonts w:ascii="Arial" w:eastAsia="Batang" w:hAnsi="Arial" w:cs="Arial"/>
+          <w:sz w:val="14"/>
+          <w:szCs w:val="14"/>
+        </w:rPr>
+        <w:t xml:space="preserve"> </w:t>
+      </w:r>
+      <w:r>
+        <w:rPr>
+          <w:rFonts w:ascii="Arial" w:eastAsia="Batang" w:hAnsi="Arial" w:cs="Arial"/>
+          <w:sz w:val="14"/>
+          <w:szCs w:val="14"/>
+        </w:rPr>
+        <w:t xml:space="preserve">se hizo constar </w:t>
+      </w:r>
+      <w:r>
+        <w:rPr>
+          <w:rFonts w:ascii="Arial" w:eastAsia="Batang" w:hAnsi="Arial" w:cs="Arial"/>
+          <w:sz w:val="14"/>
+          <w:szCs w:val="14"/>
+        </w:rPr>
+        <w:t>entre otros actos</w:t>
+      </w:r>
+      <w:r>
+        <w:rPr>
+          <w:rFonts w:ascii="Arial" w:eastAsia="Batang" w:hAnsi="Arial" w:cs="Arial"/>
+          <w:sz w:val="14"/>
+          <w:szCs w:val="14"/>
+        </w:rPr>
+        <w:t>,</w:t>
+      </w:r>
+      <w:r>
+        <w:rPr>
+          <w:rFonts w:ascii="Arial" w:eastAsia="Batang" w:hAnsi="Arial" w:cs="Arial"/>
+          <w:sz w:val="14"/>
+          <w:szCs w:val="14"/>
+        </w:rPr>
+        <w:t xml:space="preserve"> </w:t>
+      </w:r>
+      <w:r>
+        <w:rPr>
+          <w:rFonts w:ascii="Arial" w:eastAsia="Batang" w:hAnsi="Arial" w:cs="Arial"/>
+          <w:bCs/>
+          <w:sz w:val="14"/>
+          <w:szCs w:val="14"/>
+        </w:rPr>
+        <w:t xml:space="preserve">el </w:t>
+      </w:r>
+      <w:r>
+        <w:rPr>
+          <w:rFonts w:ascii="Arial" w:eastAsia="Batang" w:hAnsi="Arial" w:cs="Arial"/>
+          <w:bCs/>
+          <w:sz w:val="14"/>
+          <w:szCs w:val="14"/>
+        </w:rPr>
+        <w:t>otorgamiento de crédito y constitución de garantía hipotecaria</w:t>
+      </w:r>
+      <w:r>
+        <w:rPr>
+          <w:rFonts w:ascii="Arial" w:eastAsia="Batang" w:hAnsi="Arial" w:cs="Arial"/>
+          <w:bCs/>
+          <w:sz w:val="14"/>
+          <w:szCs w:val="14"/>
+        </w:rPr>
+        <w:t>,</w:t>
+      </w:r>
+      <w:r>
+        <w:rPr>
+          <w:rFonts w:ascii="Arial" w:eastAsia="Batang" w:hAnsi="Arial" w:cs="Arial"/>
+          <w:b/>
+          <w:sz w:val="14"/>
+          <w:szCs w:val="14"/>
+        </w:rPr>
+        <w:t xml:space="preserve"> </w:t>
+      </w:r>
+      <w:r>
+        <w:rPr>
+          <w:rFonts w:ascii="Arial" w:eastAsia="Batang" w:hAnsi="Arial" w:cs="Arial"/>
+          <w:sz w:val="14"/>
+          <w:szCs w:val="14"/>
+        </w:rPr>
+        <w:t>por medio del cual</w:t>
+      </w:r>
+      <w:r>
+        <w:rPr>
+          <w:rFonts w:ascii="Arial" w:eastAsia="Batang" w:hAnsi="Arial" w:cs="Arial"/>
+          <w:sz w:val="14"/>
+          <w:szCs w:val="14"/>
+        </w:rPr>
+        <w:t xml:space="preserve"> el</w:t>
+      </w:r>
+      <w:r>
+        <w:rPr>
+          <w:rFonts w:ascii="Arial" w:eastAsia="Batang" w:hAnsi="Arial" w:cs="Arial"/>
+          <w:sz w:val="14"/>
+          <w:szCs w:val="14"/>
+        </w:rPr>
+        <w:t xml:space="preserve"> </w:t>
+      </w:r>
+      <w:r>
+        <w:rPr>
+          <w:rFonts w:ascii="Arial" w:eastAsia="Batang" w:hAnsi="Arial" w:cs="Arial"/>
+          <w:b/>
+          <w:sz w:val="14"/>
+          <w:szCs w:val="14"/>
+        </w:rPr>
+        <w:t xml:space="preserve">INSTITUTO DEL FONDO NACIONAL </w:t>
+      </w:r>
+      <w:r>
+        <w:rPr>
+          <w:rFonts w:ascii="Arial" w:eastAsia="Batang" w:hAnsi="Arial" w:cs="Arial"/>
+          <w:b/>
+          <w:sz w:val="14"/>
+          <w:szCs w:val="14"/>
+        </w:rPr>
+        <w:t xml:space="preserve">DE LA VIVIENDA </w:t>
+      </w:r>
+      <w:r>
+        <w:rPr>
+          <w:rFonts w:ascii="Arial" w:eastAsia="Batang" w:hAnsi="Arial" w:cs="Arial"/>
+          <w:b/>
+          <w:sz w:val="14"/>
+          <w:szCs w:val="14"/>
+        </w:rPr>
+        <w:t>PARA LOS TRABAJADORES</w:t>
+      </w:r>
+      <w:r>
+        <w:rPr>
+          <w:rFonts w:ascii="Arial" w:eastAsia="Batang" w:hAnsi="Arial" w:cs="Arial"/>
+          <w:sz w:val="14"/>
+          <w:szCs w:val="14"/>
+        </w:rPr>
+        <w:t>,</w:t>
+      </w:r>
+      <w:r>
+        <w:rPr>
+          <w:rFonts w:ascii="Arial" w:eastAsia="Batang" w:hAnsi="Arial" w:cs="Arial"/>
+          <w:b/>
+          <w:sz w:val="14"/>
+          <w:szCs w:val="14"/>
+        </w:rPr>
+        <w:t xml:space="preserve"> </w:t>
+      </w:r>
+      <w:r>
+        <w:rPr>
+          <w:rFonts w:ascii="Arial" w:eastAsia="Batang" w:hAnsi="Arial" w:cs="Arial"/>
+          <w:sz w:val="14"/>
+          <w:szCs w:val="14"/>
+        </w:rPr>
+        <w:t>otorg</w:t>
+      </w:r>
+      <w:r>
+        <w:rPr>
+          <w:rFonts w:ascii="Arial" w:eastAsia="Batang" w:hAnsi="Arial" w:cs="Arial"/>
+          <w:sz w:val="14"/>
+          <w:szCs w:val="14"/>
+        </w:rPr>
+        <w:t>ó</w:t>
+      </w:r>
+      <w:r>
+        <w:rPr>
+          <w:rFonts w:ascii="Arial" w:eastAsia="Batang" w:hAnsi="Arial" w:cs="Arial"/>
+          <w:sz w:val="14"/>
+          <w:szCs w:val="14"/>
+        </w:rPr>
+        <w:t xml:space="preserve"> </w:t>
+      </w:r>
+      <w:r>
+        <w:rPr>
+          <w:rFonts w:ascii="Arial" w:eastAsia="Batang" w:hAnsi="Arial" w:cs="Arial"/>
+          <w:sz w:val="14"/>
+          <w:szCs w:val="14"/>
+        </w:rPr>
+        <w:t xml:space="preserve">a la </w:t>
+      </w:r>
+      <w:r>
+        <w:rPr>
+          <w:rFonts w:ascii="Arial" w:eastAsia="Batang" w:hAnsi="Arial" w:cs="Arial"/>
+          <w:sz w:val="14"/>
+          <w:szCs w:val="14"/>
+        </w:rPr>
+        <w:t>señor</w:t>
+      </w:r>
+      <w:r>
+        <w:rPr>
+          <w:rFonts w:ascii="Arial" w:eastAsia="Batang" w:hAnsi="Arial" w:cs="Arial"/>
+          <w:sz w:val="14"/>
+          <w:szCs w:val="14"/>
+        </w:rPr>
+        <w:t>a</w:t>
+      </w:r>
+      <w:r>
+        <w:rPr>
+          <w:rFonts w:ascii="Arial" w:hAnsi="Arial" w:cs="Arial"/>
+          <w:b/>
+          <w:bCs/>
+          <w:sz w:val="14"/>
+          <w:szCs w:val="14"/>
+          <w:lang w:val="es-ES"/>
+        </w:rPr>
+        <w:t xml:space="preserve"> </w:t>
+      </w:r>
+      <w:r>
+        <w:rPr>
+          <w:rFonts w:ascii="Arial" w:hAnsi="Arial" w:cs="Arial"/>
+          <w:b/>
           <w:sz w:val="14"/>
           <w:szCs w:val="14"/>
           <w:lang w:val="es-MX"/>
         </w:rPr>
-        <w:t xml:space="preserve"> }}</w:t>
-      </w:r>
-      <w:r>
-        <w:rPr>
-          <w:rFonts w:ascii="Arial" w:eastAsia="Batang" w:hAnsi="Arial" w:cs="Arial"/>
-          <w:sz w:val="14"/>
-          <w:szCs w:val="14"/>
+        <w:t>{{ nombre_acreditado }}</w:t>
+      </w:r>
+      <w:r>
+        <w:rPr>
+          <w:rFonts w:ascii="Arial" w:hAnsi="Arial" w:cs="Arial"/>
+          <w:bCs/>
+          <w:sz w:val="14"/>
+          <w:szCs w:val="14"/>
+        </w:rPr>
+        <w:t xml:space="preserve">, </w:t>
+      </w:r>
+      <w:r>
+        <w:rPr>
+          <w:rFonts w:ascii="Arial" w:eastAsia="Batang" w:hAnsi="Arial" w:cs="Arial"/>
+          <w:bCs/>
+          <w:sz w:val="14"/>
+          <w:szCs w:val="14"/>
+        </w:rPr>
+        <w:t xml:space="preserve">un crédito </w:t>
+      </w:r>
+      <w:r>
+        <w:rPr>
+          <w:rFonts w:ascii="Arial" w:eastAsia="Batang" w:hAnsi="Arial" w:cs="Arial"/>
+          <w:sz w:val="14"/>
+          <w:szCs w:val="14"/>
+        </w:rPr>
+        <w:t>hasta</w:t>
+      </w:r>
+      <w:r>
+        <w:rPr>
+          <w:rFonts w:ascii="Arial" w:eastAsia="Batang" w:hAnsi="Arial" w:cs="Arial"/>
+          <w:sz w:val="14"/>
+          <w:szCs w:val="14"/>
+        </w:rPr>
+        <w:t xml:space="preserve"> </w:t>
+      </w:r>
+      <w:r>
+        <w:rPr>
+          <w:rFonts w:ascii="Arial" w:eastAsia="Batang" w:hAnsi="Arial" w:cs="Arial"/>
+          <w:sz w:val="14"/>
+          <w:szCs w:val="14"/>
+        </w:rPr>
+        <w:t>por</w:t>
+      </w:r>
+      <w:r>
+        <w:rPr>
+          <w:rFonts w:ascii="Arial" w:eastAsia="Batang" w:hAnsi="Arial" w:cs="Arial"/>
+          <w:sz w:val="14"/>
+          <w:szCs w:val="14"/>
+        </w:rPr>
+        <w:t xml:space="preserve"> {{ crédito_a_salario }}</w:t>
+      </w:r>
+      <w:r>
+        <w:rPr>
+          <w:rFonts w:ascii="Arial" w:eastAsia="Batang" w:hAnsi="Arial" w:cs="Arial"/>
+          <w:sz w:val="14"/>
+          <w:szCs w:val="14"/>
+        </w:rPr>
+        <w:t xml:space="preserve"> </w:t>
+      </w:r>
+      <w:r>
+        <w:rPr>
+          <w:rFonts w:ascii="Arial" w:eastAsia="Batang" w:hAnsi="Arial" w:cs="Arial"/>
+          <w:sz w:val="14"/>
+          <w:szCs w:val="14"/>
+        </w:rPr>
+        <w:t>veces el salario mínimo mensual vigente en ese entonces</w:t>
+      </w:r>
+      <w:r>
+        <w:rPr>
+          <w:rFonts w:ascii="Arial" w:eastAsia="Batang" w:hAnsi="Arial" w:cs="Arial"/>
+          <w:sz w:val="14"/>
+          <w:szCs w:val="14"/>
+        </w:rPr>
+        <w:t xml:space="preserve"> en el Distrito Federal</w:t>
+      </w:r>
+      <w:r>
+        <w:rPr>
+          <w:rFonts w:ascii="Arial" w:eastAsia="Batang" w:hAnsi="Arial" w:cs="Arial"/>
+          <w:b/>
+          <w:bCs/>
+          <w:iCs/>
+          <w:sz w:val="14"/>
+          <w:szCs w:val="14"/>
+          <w:lang w:val="es-MX"/>
+        </w:rPr>
+        <w:t xml:space="preserve">, </w:t>
+      </w:r>
+      <w:r>
+        <w:rPr>
+          <w:rFonts w:ascii="Arial" w:eastAsia="Batang" w:hAnsi="Arial" w:cs="Arial"/>
+          <w:iCs/>
+          <w:sz w:val="14"/>
+          <w:szCs w:val="14"/>
+        </w:rPr>
+        <w:t xml:space="preserve">equivalente a esa fecha a la cantidad de </w:t>
+      </w:r>
+      <w:r>
+        <w:rPr>
+          <w:rFonts w:ascii="Arial" w:eastAsia="Batang" w:hAnsi="Arial" w:cs="Arial"/>
+          <w:b/>
+          <w:bCs/>
+          <w:iCs/>
+          <w:sz w:val="14"/>
+          <w:szCs w:val="14"/>
+        </w:rPr>
+        <w:t>{{ monto_credito }}</w:t>
+      </w:r>
+      <w:r>
+        <w:rPr>
+          <w:rFonts w:ascii="Arial" w:eastAsia="Batang" w:hAnsi="Arial" w:cs="Arial"/>
+          <w:b/>
+          <w:bCs/>
+          <w:iCs/>
+          <w:sz w:val="14"/>
+          <w:szCs w:val="14"/>
+          <w:lang w:val="es-MX"/>
         </w:rPr>
         <w:t>,</w:t>
       </w:r>
-      <w:bookmarkStart w:id="4" w:name="_Hlk150194100"/>
-      <w:r>
-        <w:rPr>
-          <w:rFonts w:ascii="Arial" w:eastAsia="Batang" w:hAnsi="Arial" w:cs="Arial"/>
-          <w:sz w:val="14"/>
-          <w:szCs w:val="14"/>
-        </w:rPr>
-        <w:t xml:space="preserve"> </w:t>
-      </w:r>
-      <w:r>
-        <w:rPr>
-          <w:rFonts w:ascii="Arial" w:eastAsia="Batang" w:hAnsi="Arial" w:cs="Arial"/>
-          <w:sz w:val="14"/>
-          <w:szCs w:val="14"/>
-          <w:lang w:val="es-ES"/>
-        </w:rPr>
-        <w:t>otorgado ante</w:t>
-      </w:r>
-      <w:bookmarkEnd w:id="4"/>
-      <w:r>
-        <w:rPr>
-          <w:rFonts w:ascii="Arial" w:eastAsia="Batang" w:hAnsi="Arial" w:cs="Arial"/>
-          <w:sz w:val="14"/>
-          <w:szCs w:val="14"/>
-          <w:lang w:val="es-ES"/>
-        </w:rPr>
-        <w:t xml:space="preserve"> la fe del Licenciado</w:t>
-      </w:r>
-      <w:r>
-        <w:rPr>
-          <w:rFonts w:ascii="Arial" w:eastAsia="Batang" w:hAnsi="Arial" w:cs="Arial"/>
-          <w:sz w:val="14"/>
-          <w:szCs w:val="14"/>
-          <w:lang w:val="es-ES"/>
-        </w:rPr>
-        <w:t xml:space="preserve"> </w:t>
-      </w:r>
-      <w:proofErr w:type="gramStart"/>
-      <w:r>
-        <w:rPr>
-          <w:rFonts w:ascii="Arial" w:eastAsia="Batang" w:hAnsi="Arial" w:cs="Arial"/>
-          <w:bCs/>
+      <w:r>
+        <w:rPr>
+          <w:rFonts w:ascii="Arial" w:eastAsia="Batang" w:hAnsi="Arial" w:cs="Arial"/>
+          <w:b/>
+          <w:bCs/>
+          <w:iCs/>
           <w:sz w:val="14"/>
           <w:szCs w:val="14"/>
           <w:lang w:val="es-MX"/>
         </w:rPr>
-        <w:t>{{ nombre</w:t>
-      </w:r>
-      <w:proofErr w:type="gramEnd"/>
-      <w:r>
-        <w:rPr>
-          <w:rFonts w:ascii="Arial" w:eastAsia="Batang" w:hAnsi="Arial" w:cs="Arial"/>
-          <w:bCs/>
-          <w:sz w:val="14"/>
-          <w:szCs w:val="14"/>
-          <w:lang w:val="es-MX"/>
-        </w:rPr>
-        <w:t>_</w:t>
-      </w:r>
-      <w:proofErr w:type="gramStart"/>
-      <w:r>
-        <w:rPr>
-          <w:rFonts w:ascii="Arial" w:eastAsia="Batang" w:hAnsi="Arial" w:cs="Arial"/>
-          <w:bCs/>
-          <w:sz w:val="14"/>
-          <w:szCs w:val="14"/>
-          <w:lang w:val="es-MX"/>
-        </w:rPr>
-        <w:t>notario }</w:t>
-      </w:r>
-      <w:proofErr w:type="gramEnd"/>
-      <w:r>
-        <w:rPr>
-          <w:rFonts w:ascii="Arial" w:eastAsia="Batang" w:hAnsi="Arial" w:cs="Arial"/>
-          <w:bCs/>
-          <w:sz w:val="14"/>
-          <w:szCs w:val="14"/>
-          <w:lang w:val="es-MX"/>
-        </w:rPr>
-        <w:t>}</w:t>
-      </w:r>
-      <w:r>
-        <w:rPr>
-          <w:rFonts w:ascii="Arial" w:eastAsia="Batang" w:hAnsi="Arial" w:cs="Arial"/>
-          <w:sz w:val="14"/>
-          <w:szCs w:val="14"/>
-        </w:rPr>
-        <w:t>,</w:t>
-      </w:r>
-      <w:r>
-        <w:rPr>
-          <w:rFonts w:ascii="Arial" w:eastAsia="Batang" w:hAnsi="Arial" w:cs="Arial"/>
-          <w:sz w:val="14"/>
-          <w:szCs w:val="14"/>
-        </w:rPr>
-        <w:t xml:space="preserve"> </w:t>
-      </w:r>
-      <w:r>
-        <w:rPr>
-          <w:rFonts w:ascii="Arial" w:eastAsia="Batang" w:hAnsi="Arial" w:cs="Arial"/>
-          <w:sz w:val="14"/>
-          <w:szCs w:val="14"/>
-        </w:rPr>
-        <w:t xml:space="preserve">se hizo constar </w:t>
-      </w:r>
-      <w:r>
-        <w:rPr>
-          <w:rFonts w:ascii="Arial" w:eastAsia="Batang" w:hAnsi="Arial" w:cs="Arial"/>
-          <w:sz w:val="14"/>
-          <w:szCs w:val="14"/>
-        </w:rPr>
-        <w:t>entre otros actos</w:t>
-      </w:r>
-      <w:r>
-        <w:rPr>
-          <w:rFonts w:ascii="Arial" w:eastAsia="Batang" w:hAnsi="Arial" w:cs="Arial"/>
-          <w:sz w:val="14"/>
-          <w:szCs w:val="14"/>
-        </w:rPr>
-        <w:t>,</w:t>
-      </w:r>
-      <w:r>
-        <w:rPr>
-          <w:rFonts w:ascii="Arial" w:eastAsia="Batang" w:hAnsi="Arial" w:cs="Arial"/>
-          <w:sz w:val="14"/>
-          <w:szCs w:val="14"/>
-        </w:rPr>
-        <w:t xml:space="preserve"> </w:t>
-      </w:r>
-      <w:r>
-        <w:rPr>
-          <w:rFonts w:ascii="Arial" w:eastAsia="Batang" w:hAnsi="Arial" w:cs="Arial"/>
-          <w:bCs/>
-          <w:sz w:val="14"/>
-          <w:szCs w:val="14"/>
-        </w:rPr>
-        <w:t xml:space="preserve">el </w:t>
-      </w:r>
-      <w:r>
-        <w:rPr>
-          <w:rFonts w:ascii="Arial" w:eastAsia="Batang" w:hAnsi="Arial" w:cs="Arial"/>
-          <w:bCs/>
-          <w:sz w:val="14"/>
-          <w:szCs w:val="14"/>
-        </w:rPr>
-        <w:t>otorgamiento de crédito y constitución de garantía hipotecaria</w:t>
-      </w:r>
-      <w:r>
-        <w:rPr>
-          <w:rFonts w:ascii="Arial" w:eastAsia="Batang" w:hAnsi="Arial" w:cs="Arial"/>
-          <w:bCs/>
-          <w:sz w:val="14"/>
-          <w:szCs w:val="14"/>
-        </w:rPr>
-        <w:t>,</w:t>
-      </w:r>
-      <w:r>
-        <w:rPr>
-          <w:rFonts w:ascii="Arial" w:eastAsia="Batang" w:hAnsi="Arial" w:cs="Arial"/>
-          <w:b/>
-          <w:sz w:val="14"/>
-          <w:szCs w:val="14"/>
-        </w:rPr>
-        <w:t xml:space="preserve"> </w:t>
-      </w:r>
-      <w:r>
-        <w:rPr>
-          <w:rFonts w:ascii="Arial" w:eastAsia="Batang" w:hAnsi="Arial" w:cs="Arial"/>
-          <w:sz w:val="14"/>
-          <w:szCs w:val="14"/>
-        </w:rPr>
-        <w:t>por medio del cual</w:t>
-      </w:r>
-      <w:r>
-        <w:rPr>
-          <w:rFonts w:ascii="Arial" w:eastAsia="Batang" w:hAnsi="Arial" w:cs="Arial"/>
-          <w:sz w:val="14"/>
-          <w:szCs w:val="14"/>
-        </w:rPr>
-        <w:t xml:space="preserve"> el</w:t>
-      </w:r>
-      <w:r>
-        <w:rPr>
-          <w:rFonts w:ascii="Arial" w:eastAsia="Batang" w:hAnsi="Arial" w:cs="Arial"/>
-          <w:sz w:val="14"/>
-          <w:szCs w:val="14"/>
-        </w:rPr>
-        <w:t xml:space="preserve"> </w:t>
-      </w:r>
-      <w:r>
-        <w:rPr>
-          <w:rFonts w:ascii="Arial" w:eastAsia="Batang" w:hAnsi="Arial" w:cs="Arial"/>
-          <w:b/>
-          <w:sz w:val="14"/>
-          <w:szCs w:val="14"/>
-        </w:rPr>
-        <w:t xml:space="preserve">INSTITUTO DEL FONDO NACIONAL </w:t>
-      </w:r>
-      <w:r>
-        <w:rPr>
-          <w:rFonts w:ascii="Arial" w:eastAsia="Batang" w:hAnsi="Arial" w:cs="Arial"/>
-          <w:b/>
-          <w:sz w:val="14"/>
-          <w:szCs w:val="14"/>
-        </w:rPr>
-        <w:t xml:space="preserve">DE LA VIVIENDA </w:t>
-      </w:r>
-      <w:r>
-        <w:rPr>
-          <w:rFonts w:ascii="Arial" w:eastAsia="Batang" w:hAnsi="Arial" w:cs="Arial"/>
-          <w:b/>
-          <w:sz w:val="14"/>
-          <w:szCs w:val="14"/>
-        </w:rPr>
-        <w:t>PARA LOS TRABAJADORES</w:t>
-      </w:r>
-      <w:r>
-        <w:rPr>
-          <w:rFonts w:ascii="Arial" w:eastAsia="Batang" w:hAnsi="Arial" w:cs="Arial"/>
-          <w:sz w:val="14"/>
-          <w:szCs w:val="14"/>
-        </w:rPr>
-        <w:t>,</w:t>
-      </w:r>
-      <w:r>
-        <w:rPr>
-          <w:rFonts w:ascii="Arial" w:eastAsia="Batang" w:hAnsi="Arial" w:cs="Arial"/>
-          <w:b/>
-          <w:sz w:val="14"/>
-          <w:szCs w:val="14"/>
-        </w:rPr>
-        <w:t xml:space="preserve"> </w:t>
-      </w:r>
-      <w:r>
-        <w:rPr>
-          <w:rFonts w:ascii="Arial" w:eastAsia="Batang" w:hAnsi="Arial" w:cs="Arial"/>
-          <w:sz w:val="14"/>
-          <w:szCs w:val="14"/>
-        </w:rPr>
-        <w:t>otorg</w:t>
-      </w:r>
-      <w:r>
-        <w:rPr>
-          <w:rFonts w:ascii="Arial" w:eastAsia="Batang" w:hAnsi="Arial" w:cs="Arial"/>
-          <w:sz w:val="14"/>
-          <w:szCs w:val="14"/>
-        </w:rPr>
-        <w:t>ó</w:t>
-      </w:r>
-      <w:r>
-        <w:rPr>
-          <w:rFonts w:ascii="Arial" w:eastAsia="Batang" w:hAnsi="Arial" w:cs="Arial"/>
-          <w:sz w:val="14"/>
-          <w:szCs w:val="14"/>
-        </w:rPr>
-        <w:t xml:space="preserve"> </w:t>
-      </w:r>
-      <w:r>
-        <w:rPr>
-          <w:rFonts w:ascii="Arial" w:eastAsia="Batang" w:hAnsi="Arial" w:cs="Arial"/>
-          <w:sz w:val="14"/>
-          <w:szCs w:val="14"/>
-        </w:rPr>
-        <w:t xml:space="preserve">a la </w:t>
-      </w:r>
-      <w:r>
-        <w:rPr>
-          <w:rFonts w:ascii="Arial" w:eastAsia="Batang" w:hAnsi="Arial" w:cs="Arial"/>
-          <w:sz w:val="14"/>
-          <w:szCs w:val="14"/>
-        </w:rPr>
-        <w:t>señor</w:t>
-      </w:r>
-      <w:r>
-        <w:rPr>
-          <w:rFonts w:ascii="Arial" w:eastAsia="Batang" w:hAnsi="Arial" w:cs="Arial"/>
-          <w:sz w:val="14"/>
-          <w:szCs w:val="14"/>
-        </w:rPr>
-        <w:t>a</w:t>
-      </w:r>
-      <w:r>
-        <w:rPr>
-          <w:rFonts w:ascii="Arial" w:hAnsi="Arial" w:cs="Arial"/>
-          <w:b/>
-          <w:bCs/>
-          <w:sz w:val="14"/>
-          <w:szCs w:val="14"/>
-          <w:lang w:val="es-ES"/>
-        </w:rPr>
-        <w:t xml:space="preserve"> </w:t>
-      </w:r>
-      <w:proofErr w:type="gramStart"/>
-      <w:r>
-        <w:rPr>
-          <w:rFonts w:ascii="Arial" w:hAnsi="Arial" w:cs="Arial"/>
-          <w:b/>
-          <w:sz w:val="14"/>
-          <w:szCs w:val="14"/>
-          <w:lang w:val="es-MX"/>
-        </w:rPr>
-        <w:t>{{ nombre</w:t>
-      </w:r>
-      <w:proofErr w:type="gramEnd"/>
-      <w:r>
-        <w:rPr>
-          <w:rFonts w:ascii="Arial" w:hAnsi="Arial" w:cs="Arial"/>
-          <w:b/>
-          <w:sz w:val="14"/>
-          <w:szCs w:val="14"/>
-          <w:lang w:val="es-MX"/>
-        </w:rPr>
-        <w:t>_</w:t>
-      </w:r>
-      <w:proofErr w:type="gramStart"/>
-      <w:r>
-        <w:rPr>
-          <w:rFonts w:ascii="Arial" w:hAnsi="Arial" w:cs="Arial"/>
-          <w:b/>
-          <w:sz w:val="14"/>
-          <w:szCs w:val="14"/>
-          <w:lang w:val="es-MX"/>
-        </w:rPr>
-        <w:t>acreditado }</w:t>
-      </w:r>
-      <w:proofErr w:type="gramEnd"/>
-      <w:r>
-        <w:rPr>
-          <w:rFonts w:ascii="Arial" w:hAnsi="Arial" w:cs="Arial"/>
-          <w:b/>
-          <w:sz w:val="14"/>
-          <w:szCs w:val="14"/>
-          <w:lang w:val="es-MX"/>
-        </w:rPr>
-        <w:t>}</w:t>
-      </w:r>
-      <w:r>
-        <w:rPr>
-          <w:rFonts w:ascii="Arial" w:hAnsi="Arial" w:cs="Arial"/>
-          <w:bCs/>
-          <w:sz w:val="14"/>
-          <w:szCs w:val="14"/>
-        </w:rPr>
-        <w:t xml:space="preserve">, </w:t>
-      </w:r>
-      <w:r>
-        <w:rPr>
-          <w:rFonts w:ascii="Arial" w:eastAsia="Batang" w:hAnsi="Arial" w:cs="Arial"/>
-          <w:bCs/>
-          <w:sz w:val="14"/>
-          <w:szCs w:val="14"/>
-        </w:rPr>
-        <w:t xml:space="preserve">un crédito </w:t>
-      </w:r>
-      <w:r>
-        <w:rPr>
-          <w:rFonts w:ascii="Arial" w:eastAsia="Batang" w:hAnsi="Arial" w:cs="Arial"/>
-          <w:sz w:val="14"/>
-          <w:szCs w:val="14"/>
-        </w:rPr>
-        <w:t>hasta</w:t>
-      </w:r>
-      <w:r>
-        <w:rPr>
-          <w:rFonts w:ascii="Arial" w:eastAsia="Batang" w:hAnsi="Arial" w:cs="Arial"/>
-          <w:sz w:val="14"/>
-          <w:szCs w:val="14"/>
-        </w:rPr>
-        <w:t xml:space="preserve"> </w:t>
-      </w:r>
-      <w:r>
-        <w:rPr>
-          <w:rFonts w:ascii="Arial" w:eastAsia="Batang" w:hAnsi="Arial" w:cs="Arial"/>
-          <w:sz w:val="14"/>
-          <w:szCs w:val="14"/>
-        </w:rPr>
-        <w:t>por</w:t>
-      </w:r>
-      <w:r>
-        <w:rPr>
-          <w:rFonts w:ascii="Arial" w:eastAsia="Batang" w:hAnsi="Arial" w:cs="Arial"/>
-          <w:sz w:val="14"/>
-          <w:szCs w:val="14"/>
-        </w:rPr>
-        <w:t xml:space="preserve"> </w:t>
-      </w:r>
-      <w:proofErr w:type="gramStart"/>
-      <w:r>
-        <w:rPr>
-          <w:rFonts w:ascii="Arial" w:eastAsia="Batang" w:hAnsi="Arial" w:cs="Arial"/>
-          <w:sz w:val="14"/>
-          <w:szCs w:val="14"/>
-        </w:rPr>
-        <w:t>{{ crédito</w:t>
-      </w:r>
-      <w:proofErr w:type="gramEnd"/>
-      <w:r>
-        <w:rPr>
-          <w:rFonts w:ascii="Arial" w:eastAsia="Batang" w:hAnsi="Arial" w:cs="Arial"/>
-          <w:sz w:val="14"/>
-          <w:szCs w:val="14"/>
-        </w:rPr>
-        <w:t>_a_</w:t>
-      </w:r>
-      <w:proofErr w:type="gramStart"/>
-      <w:r>
-        <w:rPr>
-          <w:rFonts w:ascii="Arial" w:eastAsia="Batang" w:hAnsi="Arial" w:cs="Arial"/>
-          <w:sz w:val="14"/>
-          <w:szCs w:val="14"/>
-        </w:rPr>
-        <w:t>salario }</w:t>
-      </w:r>
-      <w:proofErr w:type="gramEnd"/>
-      <w:r>
-        <w:rPr>
-          <w:rFonts w:ascii="Arial" w:eastAsia="Batang" w:hAnsi="Arial" w:cs="Arial"/>
-          <w:sz w:val="14"/>
-          <w:szCs w:val="14"/>
-        </w:rPr>
-        <w:t>}</w:t>
+        <w:t xml:space="preserve"> </w:t>
+      </w:r>
+      <w:r>
+        <w:rPr>
+          <w:rFonts w:ascii="Arial" w:eastAsia="Batang" w:hAnsi="Arial" w:cs="Arial"/>
+          <w:sz w:val="14"/>
+          <w:szCs w:val="14"/>
+        </w:rPr>
+        <w:t xml:space="preserve">con los intereses y demás </w:t>
+      </w:r>
+      <w:r>
+        <w:rPr>
+          <w:rFonts w:ascii="Arial" w:eastAsia="Batang" w:hAnsi="Arial" w:cs="Arial"/>
+          <w:sz w:val="14"/>
+          <w:szCs w:val="14"/>
+        </w:rPr>
+        <w:t xml:space="preserve">accesorios legales </w:t>
+      </w:r>
+      <w:r>
+        <w:rPr>
+          <w:rFonts w:ascii="Arial" w:eastAsia="Batang" w:hAnsi="Arial" w:cs="Arial"/>
+          <w:sz w:val="14"/>
+          <w:szCs w:val="14"/>
+        </w:rPr>
+        <w:t>ahí precisado</w:t>
+      </w:r>
+      <w:r>
+        <w:rPr>
+          <w:rFonts w:ascii="Arial" w:eastAsia="Batang" w:hAnsi="Arial" w:cs="Arial"/>
+          <w:sz w:val="14"/>
+          <w:szCs w:val="14"/>
+        </w:rPr>
+        <w:t>s.</w:t>
+      </w:r>
+      <w:r>
+        <w:rPr>
+          <w:rFonts w:ascii="Arial" w:eastAsia="Batang" w:hAnsi="Arial" w:cs="Arial"/>
+          <w:sz w:val="14"/>
+          <w:szCs w:val="14"/>
+        </w:rPr>
+        <w:tab/>
       </w:r>
     </w:p>
     <w:p>
@@ -1969,162 +1921,220 @@
           <w:rFonts w:ascii="Arial" w:eastAsia="Batang" w:hAnsi="Arial" w:cs="Arial"/>
           <w:b/>
           <w:bCs/>
-          <w:iCs/>
+          <w:sz w:val="14"/>
+          <w:szCs w:val="14"/>
+        </w:rPr>
+      </w:pPr>
+      <w:r>
+        <w:rPr>
+          <w:rFonts w:ascii="Arial" w:hAnsi="Arial" w:cs="Arial"/>
           <w:sz w:val="14"/>
           <w:szCs w:val="14"/>
           <w:lang w:val="es-MX"/>
         </w:rPr>
-      </w:pPr>
-      <w:r>
-        <w:rPr>
-          <w:rFonts w:ascii="Arial" w:eastAsia="Batang" w:hAnsi="Arial" w:cs="Arial"/>
-          <w:sz w:val="14"/>
-          <w:szCs w:val="14"/>
-        </w:rPr>
-        <w:t>veces el salario mínimo mensual vigente en ese entonces</w:t>
-      </w:r>
-      <w:r>
-        <w:rPr>
-          <w:rFonts w:ascii="Arial" w:eastAsia="Batang" w:hAnsi="Arial" w:cs="Arial"/>
-          <w:sz w:val="14"/>
-          <w:szCs w:val="14"/>
-        </w:rPr>
-        <w:t xml:space="preserve"> en el Distrito Federal</w:t>
-      </w:r>
-      <w:r>
-        <w:rPr>
-          <w:rFonts w:ascii="Arial" w:eastAsia="Batang" w:hAnsi="Arial" w:cs="Arial"/>
-          <w:b/>
-          <w:bCs/>
-          <w:iCs/>
+        <w:t xml:space="preserve">-------- </w:t>
+      </w:r>
+      <w:r>
+        <w:rPr>
+          <w:rFonts w:ascii="Arial" w:eastAsia="Batang" w:hAnsi="Arial" w:cs="Arial"/>
+          <w:sz w:val="14"/>
+          <w:szCs w:val="14"/>
+        </w:rPr>
+        <w:t>P</w:t>
+      </w:r>
+      <w:r>
+        <w:rPr>
+          <w:rFonts w:ascii="Arial" w:eastAsia="Batang" w:hAnsi="Arial" w:cs="Arial"/>
+          <w:sz w:val="14"/>
+          <w:szCs w:val="14"/>
+        </w:rPr>
+        <w:t xml:space="preserve">ara garantizar el puntual y preferente pago del adeudo, </w:t>
+      </w:r>
+      <w:r>
+        <w:rPr>
+          <w:rFonts w:ascii="Arial" w:hAnsi="Arial" w:cs="Arial"/>
+          <w:bCs/>
+          <w:sz w:val="14"/>
+          <w:szCs w:val="14"/>
+        </w:rPr>
+        <w:t>“</w:t>
+      </w:r>
+      <w:r>
+        <w:rPr>
+          <w:rFonts w:ascii="Arial" w:hAnsi="Arial" w:cs="Arial"/>
+          <w:b/>
+          <w:sz w:val="14"/>
+          <w:szCs w:val="14"/>
+        </w:rPr>
+        <w:t>LA</w:t>
+      </w:r>
+      <w:r>
+        <w:rPr>
+          <w:rFonts w:ascii="Arial" w:hAnsi="Arial" w:cs="Arial"/>
+          <w:b/>
+          <w:sz w:val="14"/>
+          <w:szCs w:val="14"/>
+        </w:rPr>
+        <w:t xml:space="preserve"> ACREDITAD</w:t>
+      </w:r>
+      <w:r>
+        <w:rPr>
+          <w:rFonts w:ascii="Arial" w:hAnsi="Arial" w:cs="Arial"/>
+          <w:b/>
+          <w:sz w:val="14"/>
+          <w:szCs w:val="14"/>
+        </w:rPr>
+        <w:t>A</w:t>
+      </w:r>
+      <w:r>
+        <w:rPr>
+          <w:rFonts w:ascii="Arial" w:hAnsi="Arial" w:cs="Arial"/>
+          <w:bCs/>
+          <w:sz w:val="14"/>
+          <w:szCs w:val="14"/>
+        </w:rPr>
+        <w:t>”</w:t>
+      </w:r>
+      <w:r>
+        <w:rPr>
+          <w:rFonts w:ascii="Arial" w:hAnsi="Arial" w:cs="Arial"/>
+          <w:b/>
+          <w:bCs/>
+          <w:sz w:val="14"/>
+          <w:szCs w:val="14"/>
+          <w:lang w:val="es-ES"/>
+        </w:rPr>
+        <w:t>,</w:t>
+      </w:r>
+      <w:r>
+        <w:rPr>
+          <w:rFonts w:ascii="Arial" w:eastAsia="Batang" w:hAnsi="Arial" w:cs="Arial"/>
+          <w:b/>
+          <w:sz w:val="14"/>
+          <w:szCs w:val="14"/>
+        </w:rPr>
+        <w:t xml:space="preserve"> </w:t>
+      </w:r>
+      <w:r>
+        <w:rPr>
+          <w:rFonts w:ascii="Arial" w:eastAsia="Batang" w:hAnsi="Arial" w:cs="Arial"/>
+          <w:sz w:val="14"/>
+          <w:szCs w:val="14"/>
+        </w:rPr>
+        <w:t>constituy</w:t>
+      </w:r>
+      <w:r>
+        <w:rPr>
+          <w:rFonts w:ascii="Arial" w:eastAsia="Batang" w:hAnsi="Arial" w:cs="Arial"/>
+          <w:sz w:val="14"/>
+          <w:szCs w:val="14"/>
+        </w:rPr>
+        <w:t>ó</w:t>
+      </w:r>
+      <w:r>
+        <w:rPr>
+          <w:rFonts w:ascii="Arial" w:eastAsia="Batang" w:hAnsi="Arial" w:cs="Arial"/>
+          <w:sz w:val="14"/>
+          <w:szCs w:val="14"/>
+        </w:rPr>
+        <w:t xml:space="preserve"> </w:t>
+      </w:r>
+      <w:r>
+        <w:rPr>
+          <w:rFonts w:ascii="Arial" w:eastAsia="Batang" w:hAnsi="Arial" w:cs="Arial"/>
+          <w:sz w:val="14"/>
+          <w:szCs w:val="14"/>
+        </w:rPr>
+        <w:t>hipoteca en primer</w:t>
+      </w:r>
+      <w:r>
+        <w:rPr>
+          <w:rFonts w:ascii="Arial" w:eastAsia="Batang" w:hAnsi="Arial" w:cs="Arial"/>
+          <w:sz w:val="14"/>
+          <w:szCs w:val="14"/>
+        </w:rPr>
+        <w:t xml:space="preserve"> lugar y </w:t>
+      </w:r>
+      <w:r>
+        <w:rPr>
+          <w:rFonts w:ascii="Arial" w:eastAsia="Batang" w:hAnsi="Arial" w:cs="Arial"/>
+          <w:sz w:val="14"/>
+          <w:szCs w:val="14"/>
+        </w:rPr>
+        <w:t xml:space="preserve">grado, </w:t>
+      </w:r>
+      <w:r>
+        <w:rPr>
+          <w:rFonts w:ascii="Arial" w:eastAsia="Batang" w:hAnsi="Arial" w:cs="Arial"/>
+          <w:sz w:val="14"/>
+          <w:szCs w:val="14"/>
+        </w:rPr>
+        <w:t>a</w:t>
+      </w:r>
+      <w:r>
+        <w:rPr>
+          <w:rFonts w:ascii="Arial" w:eastAsia="Batang" w:hAnsi="Arial" w:cs="Arial"/>
+          <w:sz w:val="14"/>
+          <w:szCs w:val="14"/>
+        </w:rPr>
+        <w:t xml:space="preserve"> favor del </w:t>
+      </w:r>
+      <w:r>
+        <w:rPr>
+          <w:rFonts w:ascii="Arial" w:eastAsia="Batang" w:hAnsi="Arial" w:cs="Arial"/>
+          <w:b/>
+          <w:sz w:val="14"/>
+          <w:szCs w:val="14"/>
+        </w:rPr>
+        <w:t>INSTITUTO DEL FONDO NACIONAL DE LA VIVIENDA PARA LOS TRABAJADORES</w:t>
+      </w:r>
+      <w:r>
+        <w:rPr>
+          <w:rFonts w:ascii="Arial" w:eastAsia="Batang" w:hAnsi="Arial" w:cs="Arial"/>
+          <w:bCs/>
+          <w:sz w:val="14"/>
+          <w:szCs w:val="14"/>
+        </w:rPr>
+        <w:t>,</w:t>
+      </w:r>
+      <w:r>
+        <w:rPr>
+          <w:rFonts w:ascii="Arial" w:eastAsia="Batang" w:hAnsi="Arial" w:cs="Arial"/>
+          <w:sz w:val="14"/>
+          <w:szCs w:val="14"/>
+        </w:rPr>
+        <w:t xml:space="preserve"> </w:t>
+      </w:r>
+      <w:r>
+        <w:rPr>
+          <w:rFonts w:ascii="Arial" w:eastAsia="Batang" w:hAnsi="Arial" w:cs="Arial"/>
+          <w:sz w:val="14"/>
+          <w:szCs w:val="14"/>
+        </w:rPr>
+        <w:t>sobre</w:t>
+      </w:r>
+      <w:r>
+        <w:rPr>
+          <w:rFonts w:ascii="Arial" w:eastAsia="Batang" w:hAnsi="Arial" w:cs="Arial"/>
+          <w:sz w:val="14"/>
+          <w:szCs w:val="14"/>
+        </w:rPr>
+        <w:t xml:space="preserve"> </w:t>
+      </w:r>
+      <w:r>
+        <w:rPr>
+          <w:rFonts w:ascii="Arial" w:eastAsia="Batang" w:hAnsi="Arial" w:cs="Arial"/>
+          <w:b/>
+          <w:bCs/>
           <w:sz w:val="14"/>
           <w:szCs w:val="14"/>
           <w:lang w:val="es-MX"/>
         </w:rPr>
-        <w:t xml:space="preserve">, </w:t>
-      </w:r>
-      <w:r>
-        <w:rPr>
-          <w:rFonts w:ascii="Arial" w:eastAsia="Batang" w:hAnsi="Arial" w:cs="Arial"/>
-          <w:iCs/>
-          <w:sz w:val="14"/>
-          <w:szCs w:val="14"/>
-        </w:rPr>
-        <w:t xml:space="preserve">equivalente a esa fecha a la cantidad de </w:t>
-      </w:r>
-      <w:proofErr w:type="gramStart"/>
-      <w:r>
-        <w:rPr>
-          <w:rFonts w:ascii="Arial" w:eastAsia="Batang" w:hAnsi="Arial" w:cs="Arial"/>
-          <w:b/>
-          <w:bCs/>
-          <w:iCs/>
-          <w:sz w:val="14"/>
-          <w:szCs w:val="14"/>
-        </w:rPr>
-        <w:t>{{ monto</w:t>
-      </w:r>
-      <w:proofErr w:type="gramEnd"/>
-      <w:r>
-        <w:rPr>
-          <w:rFonts w:ascii="Arial" w:eastAsia="Batang" w:hAnsi="Arial" w:cs="Arial"/>
-          <w:b/>
-          <w:bCs/>
-          <w:iCs/>
-          <w:sz w:val="14"/>
-          <w:szCs w:val="14"/>
-        </w:rPr>
-        <w:t>_</w:t>
-      </w:r>
-      <w:proofErr w:type="gramStart"/>
-      <w:r>
-        <w:rPr>
-          <w:rFonts w:ascii="Arial" w:eastAsia="Batang" w:hAnsi="Arial" w:cs="Arial"/>
-          <w:b/>
-          <w:bCs/>
-          <w:iCs/>
-          <w:sz w:val="14"/>
-          <w:szCs w:val="14"/>
-        </w:rPr>
-        <w:t>credito }</w:t>
-      </w:r>
-      <w:proofErr w:type="gramEnd"/>
-      <w:r>
-        <w:rPr>
-          <w:rFonts w:ascii="Arial" w:eastAsia="Batang" w:hAnsi="Arial" w:cs="Arial"/>
-          <w:b/>
-          <w:bCs/>
-          <w:iCs/>
-          <w:sz w:val="14"/>
-          <w:szCs w:val="14"/>
-        </w:rPr>
-        <w:t>}</w:t>
-      </w:r>
-      <w:r>
-        <w:rPr>
-          <w:rFonts w:ascii="Arial" w:eastAsia="Batang" w:hAnsi="Arial" w:cs="Arial"/>
-          <w:b/>
-          <w:bCs/>
-          <w:iCs/>
-          <w:sz w:val="14"/>
-          <w:szCs w:val="14"/>
-        </w:rPr>
-        <w:t xml:space="preserve"> (</w:t>
-      </w:r>
-      <w:proofErr w:type="gramStart"/>
-      <w:r>
-        <w:rPr>
-          <w:rFonts w:ascii="Arial" w:eastAsia="Batang" w:hAnsi="Arial" w:cs="Arial"/>
-          <w:b/>
-          <w:bCs/>
-          <w:iCs/>
-          <w:sz w:val="14"/>
-          <w:szCs w:val="14"/>
-        </w:rPr>
-        <w:t>{{ monto</w:t>
-      </w:r>
-      <w:proofErr w:type="gramEnd"/>
-      <w:r>
-        <w:rPr>
-          <w:rFonts w:ascii="Arial" w:eastAsia="Batang" w:hAnsi="Arial" w:cs="Arial"/>
-          <w:b/>
-          <w:bCs/>
-          <w:iCs/>
-          <w:sz w:val="14"/>
-          <w:szCs w:val="14"/>
-        </w:rPr>
-        <w:t>_</w:t>
-      </w:r>
-      <w:proofErr w:type="gramStart"/>
-      <w:r>
-        <w:rPr>
-          <w:rFonts w:ascii="Arial" w:eastAsia="Batang" w:hAnsi="Arial" w:cs="Arial"/>
-          <w:b/>
-          <w:bCs/>
-          <w:iCs/>
-          <w:sz w:val="14"/>
-          <w:szCs w:val="14"/>
-        </w:rPr>
-        <w:t>letras }</w:t>
-      </w:r>
-      <w:proofErr w:type="gramEnd"/>
-      <w:r>
-        <w:rPr>
-          <w:rFonts w:ascii="Arial" w:eastAsia="Batang" w:hAnsi="Arial" w:cs="Arial"/>
-          <w:b/>
-          <w:bCs/>
-          <w:iCs/>
-          <w:sz w:val="14"/>
-          <w:szCs w:val="14"/>
-        </w:rPr>
-        <w:t>})</w:t>
-      </w:r>
-      <w:r>
-        <w:rPr>
-          <w:rFonts w:ascii="Arial" w:eastAsia="Batang" w:hAnsi="Arial" w:cs="Arial"/>
-          <w:b/>
-          <w:bCs/>
-          <w:iCs/>
+        <w:t>{{ datos_inmueble }}</w:t>
+      </w:r>
+      <w:r>
+        <w:rPr>
+          <w:rFonts w:ascii="Arial" w:eastAsia="Batang" w:hAnsi="Arial" w:cs="Arial"/>
           <w:sz w:val="14"/>
           <w:szCs w:val="14"/>
           <w:lang w:val="es-MX"/>
@@ -2134,9 +2144,6 @@
       <w:r>
         <w:rPr>
           <w:rFonts w:ascii="Arial" w:eastAsia="Batang" w:hAnsi="Arial" w:cs="Arial"/>
-          <w:b/>
-          <w:bCs/>
-          <w:iCs/>
           <w:sz w:val="14"/>
           <w:szCs w:val="14"/>
           <w:lang w:val="es-MX"/>
@@ -2149,31 +2156,95 @@
           <w:sz w:val="14"/>
           <w:szCs w:val="14"/>
         </w:rPr>
-        <w:t xml:space="preserve">con los intereses y demás </w:t>
-      </w:r>
-      <w:r>
-        <w:rPr>
-          <w:rFonts w:ascii="Arial" w:eastAsia="Batang" w:hAnsi="Arial" w:cs="Arial"/>
-          <w:sz w:val="14"/>
-          <w:szCs w:val="14"/>
-        </w:rPr>
-        <w:t xml:space="preserve">accesorios legales </w:t>
-      </w:r>
-      <w:r>
-        <w:rPr>
-          <w:rFonts w:ascii="Arial" w:eastAsia="Batang" w:hAnsi="Arial" w:cs="Arial"/>
-          <w:sz w:val="14"/>
-          <w:szCs w:val="14"/>
-        </w:rPr>
-        <w:t>ahí precisado</w:t>
-      </w:r>
-      <w:r>
-        <w:rPr>
-          <w:rFonts w:ascii="Arial" w:eastAsia="Batang" w:hAnsi="Arial" w:cs="Arial"/>
-          <w:sz w:val="14"/>
-          <w:szCs w:val="14"/>
-        </w:rPr>
-        <w:t>s.</w:t>
+        <w:t>con la superficie, medidas</w:t>
+      </w:r>
+      <w:r>
+        <w:rPr>
+          <w:rFonts w:ascii="Arial" w:eastAsia="Batang" w:hAnsi="Arial" w:cs="Arial"/>
+          <w:sz w:val="14"/>
+          <w:szCs w:val="14"/>
+        </w:rPr>
+        <w:t>, linderos</w:t>
+      </w:r>
+      <w:r>
+        <w:rPr>
+          <w:rFonts w:ascii="Arial" w:eastAsia="Batang" w:hAnsi="Arial" w:cs="Arial"/>
+          <w:sz w:val="14"/>
+          <w:szCs w:val="14"/>
+        </w:rPr>
+        <w:t>,</w:t>
+      </w:r>
+      <w:r>
+        <w:rPr>
+          <w:rFonts w:ascii="Arial" w:eastAsia="Batang" w:hAnsi="Arial" w:cs="Arial"/>
+          <w:sz w:val="14"/>
+          <w:szCs w:val="14"/>
+        </w:rPr>
+        <w:t xml:space="preserve"> </w:t>
+      </w:r>
+      <w:r>
+        <w:rPr>
+          <w:rFonts w:ascii="Arial" w:eastAsia="Batang" w:hAnsi="Arial" w:cs="Arial"/>
+          <w:sz w:val="14"/>
+          <w:szCs w:val="14"/>
+        </w:rPr>
+        <w:t>colindancias</w:t>
+      </w:r>
+      <w:r>
+        <w:rPr>
+          <w:rFonts w:ascii="Arial" w:eastAsia="Batang" w:hAnsi="Arial" w:cs="Arial"/>
+          <w:sz w:val="14"/>
+          <w:szCs w:val="14"/>
+        </w:rPr>
+        <w:t xml:space="preserve"> </w:t>
+      </w:r>
+      <w:r>
+        <w:rPr>
+          <w:rFonts w:ascii="Arial" w:eastAsia="Batang" w:hAnsi="Arial" w:cs="Arial"/>
+          <w:sz w:val="14"/>
+          <w:szCs w:val="14"/>
+        </w:rPr>
+        <w:t>e</w:t>
+      </w:r>
+      <w:r>
+        <w:rPr>
+          <w:rFonts w:ascii="Arial" w:eastAsia="Batang" w:hAnsi="Arial" w:cs="Arial"/>
+          <w:sz w:val="14"/>
+          <w:szCs w:val="14"/>
+        </w:rPr>
+        <w:t xml:space="preserve"> </w:t>
+      </w:r>
+      <w:r>
+        <w:rPr>
+          <w:rFonts w:ascii="Arial" w:eastAsia="Batang" w:hAnsi="Arial" w:cs="Arial"/>
+          <w:sz w:val="14"/>
+          <w:szCs w:val="14"/>
+        </w:rPr>
+        <w:t xml:space="preserve">indiviso, </w:t>
+      </w:r>
+      <w:r>
+        <w:rPr>
+          <w:rFonts w:ascii="Arial" w:eastAsia="Batang" w:hAnsi="Arial" w:cs="Arial"/>
+          <w:sz w:val="14"/>
+          <w:szCs w:val="14"/>
+        </w:rPr>
+        <w:t>que q</w:t>
+      </w:r>
+      <w:r>
+        <w:rPr>
+          <w:rFonts w:ascii="Arial" w:eastAsia="Batang" w:hAnsi="Arial" w:cs="Arial"/>
+          <w:sz w:val="14"/>
+          <w:szCs w:val="14"/>
+        </w:rPr>
+        <w:t>uedaron descritos en el instrumento que se relaciona, mismos datos que se tienen aquí por reproducidos como si a la letra se insertasen</w:t>
+      </w:r>
+      <w:r>
+        <w:rPr>
+          <w:rFonts w:ascii="Arial" w:eastAsia="Batang" w:hAnsi="Arial" w:cs="Arial"/>
+          <w:sz w:val="14"/>
+          <w:szCs w:val="14"/>
+        </w:rPr>
+        <w:t>.</w:t>
       </w:r>
       <w:r>
         <w:rPr>
@@ -2195,11 +2266,10 @@
         <w:spacing w:line="360" w:lineRule="auto"/>
         <w:jc w:val="both"/>
         <w:rPr>
-          <w:rFonts w:ascii="Arial" w:eastAsia="Batang" w:hAnsi="Arial" w:cs="Arial"/>
-          <w:b/>
-          <w:bCs/>
-          <w:sz w:val="14"/>
-          <w:szCs w:val="14"/>
+          <w:rFonts w:ascii="Arial" w:hAnsi="Arial" w:cs="Arial"/>
+          <w:sz w:val="14"/>
+          <w:szCs w:val="14"/>
+          <w:lang w:val="es-ES"/>
         </w:rPr>
       </w:pPr>
       <w:r>
@@ -2213,360 +2283,114 @@
       </w:r>
       <w:r>
         <w:rPr>
-          <w:rFonts w:ascii="Arial" w:eastAsia="Batang" w:hAnsi="Arial" w:cs="Arial"/>
-          <w:sz w:val="14"/>
-          <w:szCs w:val="14"/>
-        </w:rPr>
-        <w:t>P</w:t>
-      </w:r>
-      <w:r>
-        <w:rPr>
-          <w:rFonts w:ascii="Arial" w:eastAsia="Batang" w:hAnsi="Arial" w:cs="Arial"/>
-          <w:sz w:val="14"/>
-          <w:szCs w:val="14"/>
-        </w:rPr>
-        <w:t xml:space="preserve">ara garantizar el puntual y preferente pago del adeudo, </w:t>
-      </w:r>
-      <w:r>
-        <w:rPr>
-          <w:rFonts w:ascii="Arial" w:hAnsi="Arial" w:cs="Arial"/>
-          <w:bCs/>
-          <w:sz w:val="14"/>
-          <w:szCs w:val="14"/>
-        </w:rPr>
-        <w:t>“</w:t>
-      </w:r>
-      <w:r>
-        <w:rPr>
-          <w:rFonts w:ascii="Arial" w:hAnsi="Arial" w:cs="Arial"/>
-          <w:b/>
-          <w:sz w:val="14"/>
-          <w:szCs w:val="14"/>
-        </w:rPr>
-        <w:t>LA</w:t>
-      </w:r>
-      <w:r>
-        <w:rPr>
-          <w:rFonts w:ascii="Arial" w:hAnsi="Arial" w:cs="Arial"/>
-          <w:b/>
-          <w:sz w:val="14"/>
-          <w:szCs w:val="14"/>
-        </w:rPr>
-        <w:t xml:space="preserve"> ACREDITAD</w:t>
-      </w:r>
-      <w:r>
-        <w:rPr>
-          <w:rFonts w:ascii="Arial" w:hAnsi="Arial" w:cs="Arial"/>
-          <w:b/>
-          <w:sz w:val="14"/>
-          <w:szCs w:val="14"/>
-        </w:rPr>
-        <w:t>A</w:t>
-      </w:r>
-      <w:r>
-        <w:rPr>
-          <w:rFonts w:ascii="Arial" w:hAnsi="Arial" w:cs="Arial"/>
-          <w:bCs/>
-          <w:sz w:val="14"/>
-          <w:szCs w:val="14"/>
-        </w:rPr>
-        <w:t>”</w:t>
-      </w:r>
-      <w:r>
-        <w:rPr>
-          <w:rFonts w:ascii="Arial" w:hAnsi="Arial" w:cs="Arial"/>
-          <w:b/>
-          <w:bCs/>
+          <w:rFonts w:ascii="Arial" w:hAnsi="Arial" w:cs="Arial"/>
+          <w:b/>
           <w:sz w:val="14"/>
           <w:szCs w:val="14"/>
           <w:lang w:val="es-ES"/>
         </w:rPr>
-        <w:t>,</w:t>
-      </w:r>
-      <w:r>
-        <w:rPr>
-          <w:rFonts w:ascii="Arial" w:eastAsia="Batang" w:hAnsi="Arial" w:cs="Arial"/>
-          <w:b/>
-          <w:sz w:val="14"/>
-          <w:szCs w:val="14"/>
-        </w:rPr>
-        <w:t xml:space="preserve"> </w:t>
-      </w:r>
-      <w:r>
-        <w:rPr>
-          <w:rFonts w:ascii="Arial" w:eastAsia="Batang" w:hAnsi="Arial" w:cs="Arial"/>
-          <w:sz w:val="14"/>
-          <w:szCs w:val="14"/>
-        </w:rPr>
-        <w:t>constituy</w:t>
-      </w:r>
-      <w:r>
-        <w:rPr>
-          <w:rFonts w:ascii="Arial" w:eastAsia="Batang" w:hAnsi="Arial" w:cs="Arial"/>
-          <w:sz w:val="14"/>
-          <w:szCs w:val="14"/>
-        </w:rPr>
-        <w:t>ó</w:t>
-      </w:r>
-      <w:r>
-        <w:rPr>
-          <w:rFonts w:ascii="Arial" w:eastAsia="Batang" w:hAnsi="Arial" w:cs="Arial"/>
-          <w:sz w:val="14"/>
-          <w:szCs w:val="14"/>
-        </w:rPr>
-        <w:t xml:space="preserve"> </w:t>
-      </w:r>
-      <w:r>
-        <w:rPr>
-          <w:rFonts w:ascii="Arial" w:eastAsia="Batang" w:hAnsi="Arial" w:cs="Arial"/>
-          <w:sz w:val="14"/>
-          <w:szCs w:val="14"/>
-        </w:rPr>
-        <w:t>hipoteca en primer</w:t>
-      </w:r>
-      <w:r>
-        <w:rPr>
-          <w:rFonts w:ascii="Arial" w:eastAsia="Batang" w:hAnsi="Arial" w:cs="Arial"/>
-          <w:sz w:val="14"/>
-          <w:szCs w:val="14"/>
-        </w:rPr>
-        <w:t xml:space="preserve"> lugar y </w:t>
-      </w:r>
-      <w:r>
-        <w:rPr>
-          <w:rFonts w:ascii="Arial" w:eastAsia="Batang" w:hAnsi="Arial" w:cs="Arial"/>
-          <w:sz w:val="14"/>
-          <w:szCs w:val="14"/>
-        </w:rPr>
-        <w:t xml:space="preserve">grado, </w:t>
-      </w:r>
-      <w:r>
-        <w:rPr>
-          <w:rFonts w:ascii="Arial" w:eastAsia="Batang" w:hAnsi="Arial" w:cs="Arial"/>
-          <w:sz w:val="14"/>
-          <w:szCs w:val="14"/>
-        </w:rPr>
-        <w:t>a</w:t>
-      </w:r>
-      <w:r>
-        <w:rPr>
-          <w:rFonts w:ascii="Arial" w:eastAsia="Batang" w:hAnsi="Arial" w:cs="Arial"/>
-          <w:sz w:val="14"/>
-          <w:szCs w:val="14"/>
-        </w:rPr>
-        <w:t xml:space="preserve"> favor del </w:t>
-      </w:r>
-      <w:r>
-        <w:rPr>
-          <w:rFonts w:ascii="Arial" w:eastAsia="Batang" w:hAnsi="Arial" w:cs="Arial"/>
-          <w:b/>
-          <w:sz w:val="14"/>
-          <w:szCs w:val="14"/>
-        </w:rPr>
-        <w:t>INSTITUTO DEL FONDO NACIONAL DE LA VIVIENDA PARA LOS TRABAJADORES</w:t>
-      </w:r>
-      <w:r>
-        <w:rPr>
-          <w:rFonts w:ascii="Arial" w:eastAsia="Batang" w:hAnsi="Arial" w:cs="Arial"/>
-          <w:bCs/>
-          <w:sz w:val="14"/>
-          <w:szCs w:val="14"/>
-        </w:rPr>
-        <w:t>,</w:t>
-      </w:r>
-      <w:r>
-        <w:rPr>
-          <w:rFonts w:ascii="Arial" w:eastAsia="Batang" w:hAnsi="Arial" w:cs="Arial"/>
-          <w:sz w:val="14"/>
-          <w:szCs w:val="14"/>
-        </w:rPr>
-        <w:t xml:space="preserve"> </w:t>
-      </w:r>
-      <w:r>
-        <w:rPr>
-          <w:rFonts w:ascii="Arial" w:eastAsia="Batang" w:hAnsi="Arial" w:cs="Arial"/>
-          <w:sz w:val="14"/>
-          <w:szCs w:val="14"/>
-        </w:rPr>
-        <w:t>sobre</w:t>
-      </w:r>
-      <w:r>
-        <w:rPr>
-          <w:rFonts w:ascii="Arial" w:eastAsia="Batang" w:hAnsi="Arial" w:cs="Arial"/>
-          <w:sz w:val="14"/>
-          <w:szCs w:val="14"/>
-        </w:rPr>
-        <w:t xml:space="preserve"> </w:t>
-      </w:r>
-      <w:proofErr w:type="gramStart"/>
-      <w:r>
-        <w:rPr>
-          <w:rFonts w:ascii="Arial" w:eastAsia="Batang" w:hAnsi="Arial" w:cs="Arial"/>
-          <w:b/>
-          <w:bCs/>
-          <w:sz w:val="14"/>
-          <w:szCs w:val="14"/>
-          <w:lang w:val="es-MX"/>
-        </w:rPr>
-        <w:t>{{ datos</w:t>
-      </w:r>
-      <w:proofErr w:type="gramEnd"/>
-      <w:r>
-        <w:rPr>
-          <w:rFonts w:ascii="Arial" w:eastAsia="Batang" w:hAnsi="Arial" w:cs="Arial"/>
-          <w:b/>
-          <w:bCs/>
-          <w:sz w:val="14"/>
-          <w:szCs w:val="14"/>
-          <w:lang w:val="es-MX"/>
-        </w:rPr>
-        <w:t>_</w:t>
-      </w:r>
-      <w:proofErr w:type="gramStart"/>
-      <w:r>
-        <w:rPr>
-          <w:rFonts w:ascii="Arial" w:eastAsia="Batang" w:hAnsi="Arial" w:cs="Arial"/>
-          <w:b/>
-          <w:bCs/>
-          <w:sz w:val="14"/>
-          <w:szCs w:val="14"/>
-          <w:lang w:val="es-MX"/>
-        </w:rPr>
-        <w:t>inmueble }</w:t>
-      </w:r>
-      <w:proofErr w:type="gramEnd"/>
-      <w:r>
-        <w:rPr>
-          <w:rFonts w:ascii="Arial" w:eastAsia="Batang" w:hAnsi="Arial" w:cs="Arial"/>
-          <w:b/>
-          <w:bCs/>
-          <w:sz w:val="14"/>
-          <w:szCs w:val="14"/>
-          <w:lang w:val="es-MX"/>
-        </w:rPr>
-        <w:t>}</w:t>
-      </w:r>
-      <w:r>
-        <w:rPr>
-          <w:rFonts w:ascii="Arial" w:eastAsia="Batang" w:hAnsi="Arial" w:cs="Arial"/>
-          <w:sz w:val="14"/>
-          <w:szCs w:val="14"/>
-          <w:lang w:val="es-MX"/>
-        </w:rPr>
-        <w:t>,</w:t>
-      </w:r>
-      <w:r>
-        <w:rPr>
-          <w:rFonts w:ascii="Arial" w:eastAsia="Batang" w:hAnsi="Arial" w:cs="Arial"/>
-          <w:sz w:val="14"/>
-          <w:szCs w:val="14"/>
-          <w:lang w:val="es-MX"/>
-        </w:rPr>
-        <w:t xml:space="preserve"> </w:t>
-      </w:r>
-      <w:r>
-        <w:rPr>
-          <w:rFonts w:ascii="Arial" w:eastAsia="Batang" w:hAnsi="Arial" w:cs="Arial"/>
-          <w:sz w:val="14"/>
-          <w:szCs w:val="14"/>
-        </w:rPr>
-        <w:t>con la superficie, medidas</w:t>
-      </w:r>
-      <w:r>
-        <w:rPr>
-          <w:rFonts w:ascii="Arial" w:eastAsia="Batang" w:hAnsi="Arial" w:cs="Arial"/>
-          <w:sz w:val="14"/>
-          <w:szCs w:val="14"/>
-        </w:rPr>
-        <w:t>, linderos</w:t>
-      </w:r>
-      <w:r>
-        <w:rPr>
-          <w:rFonts w:ascii="Arial" w:eastAsia="Batang" w:hAnsi="Arial" w:cs="Arial"/>
-          <w:sz w:val="14"/>
-          <w:szCs w:val="14"/>
-        </w:rPr>
-        <w:t>,</w:t>
-      </w:r>
-      <w:r>
-        <w:rPr>
-          <w:rFonts w:ascii="Arial" w:eastAsia="Batang" w:hAnsi="Arial" w:cs="Arial"/>
-          <w:sz w:val="14"/>
-          <w:szCs w:val="14"/>
-        </w:rPr>
-        <w:t xml:space="preserve"> </w:t>
-      </w:r>
-      <w:r>
-        <w:rPr>
-          <w:rFonts w:ascii="Arial" w:eastAsia="Batang" w:hAnsi="Arial" w:cs="Arial"/>
-          <w:sz w:val="14"/>
-          <w:szCs w:val="14"/>
-        </w:rPr>
-        <w:t>colindancias</w:t>
-      </w:r>
-      <w:r>
-        <w:rPr>
-          <w:rFonts w:ascii="Arial" w:eastAsia="Batang" w:hAnsi="Arial" w:cs="Arial"/>
-          <w:sz w:val="14"/>
-          <w:szCs w:val="14"/>
-        </w:rPr>
-        <w:t xml:space="preserve"> </w:t>
-      </w:r>
-      <w:r>
-        <w:rPr>
-          <w:rFonts w:ascii="Arial" w:eastAsia="Batang" w:hAnsi="Arial" w:cs="Arial"/>
-          <w:sz w:val="14"/>
-          <w:szCs w:val="14"/>
-        </w:rPr>
-        <w:t>e</w:t>
-      </w:r>
-      <w:r>
-        <w:rPr>
-          <w:rFonts w:ascii="Arial" w:eastAsia="Batang" w:hAnsi="Arial" w:cs="Arial"/>
-          <w:sz w:val="14"/>
-          <w:szCs w:val="14"/>
-        </w:rPr>
-        <w:t xml:space="preserve"> </w:t>
-      </w:r>
-      <w:r>
-        <w:rPr>
-          <w:rFonts w:ascii="Arial" w:eastAsia="Batang" w:hAnsi="Arial" w:cs="Arial"/>
-          <w:sz w:val="14"/>
-          <w:szCs w:val="14"/>
-        </w:rPr>
-        <w:t xml:space="preserve">indiviso, </w:t>
-      </w:r>
-      <w:r>
-        <w:rPr>
-          <w:rFonts w:ascii="Arial" w:eastAsia="Batang" w:hAnsi="Arial" w:cs="Arial"/>
-          <w:sz w:val="14"/>
-          <w:szCs w:val="14"/>
-        </w:rPr>
-        <w:t>que q</w:t>
-      </w:r>
-      <w:r>
-        <w:rPr>
-          <w:rFonts w:ascii="Arial" w:eastAsia="Batang" w:hAnsi="Arial" w:cs="Arial"/>
-          <w:sz w:val="14"/>
-          <w:szCs w:val="14"/>
-        </w:rPr>
-        <w:t>uedaron descritos en el instrumento que se relaciona, mismos datos que se tienen aquí por reproducidos como si a la letra se insertasen</w:t>
-      </w:r>
-      <w:r>
-        <w:rPr>
-          <w:rFonts w:ascii="Arial" w:eastAsia="Batang" w:hAnsi="Arial" w:cs="Arial"/>
-          <w:sz w:val="14"/>
-          <w:szCs w:val="14"/>
-        </w:rPr>
-        <w:t>.</w:t>
-      </w:r>
-      <w:r>
-        <w:rPr>
-          <w:rFonts w:ascii="Arial" w:eastAsia="Batang" w:hAnsi="Arial" w:cs="Arial"/>
-          <w:sz w:val="14"/>
-          <w:szCs w:val="14"/>
-        </w:rPr>
-        <w:tab/>
+        <w:t xml:space="preserve">DATOS DE </w:t>
+      </w:r>
+      <w:r>
+        <w:rPr>
+          <w:rFonts w:ascii="Arial" w:hAnsi="Arial" w:cs="Arial"/>
+          <w:b/>
+          <w:sz w:val="14"/>
+          <w:szCs w:val="14"/>
+          <w:lang w:val="es-ES"/>
+        </w:rPr>
+        <w:t>REGISTR</w:t>
+      </w:r>
+      <w:r>
+        <w:rPr>
+          <w:rFonts w:ascii="Arial" w:hAnsi="Arial" w:cs="Arial"/>
+          <w:b/>
+          <w:sz w:val="14"/>
+          <w:szCs w:val="14"/>
+          <w:lang w:val="es-ES"/>
+        </w:rPr>
+        <w:t>O</w:t>
+      </w:r>
+      <w:r>
+        <w:rPr>
+          <w:rFonts w:ascii="Arial" w:hAnsi="Arial" w:cs="Arial"/>
+          <w:sz w:val="14"/>
+          <w:szCs w:val="14"/>
+          <w:lang w:val="es-ES"/>
+        </w:rPr>
+        <w:t>. -</w:t>
+      </w:r>
+      <w:r>
+        <w:rPr>
+          <w:rFonts w:ascii="Arial" w:hAnsi="Arial" w:cs="Arial"/>
+          <w:sz w:val="14"/>
+          <w:szCs w:val="14"/>
+          <w:lang w:val="es-ES"/>
+        </w:rPr>
+        <w:t xml:space="preserve"> </w:t>
+      </w:r>
+      <w:r>
+        <w:rPr>
+          <w:rFonts w:ascii="Arial" w:hAnsi="Arial" w:cs="Arial"/>
+          <w:sz w:val="14"/>
+          <w:szCs w:val="14"/>
+          <w:lang w:val="es-ES"/>
+        </w:rPr>
+        <w:t>El</w:t>
+      </w:r>
+      <w:r>
+        <w:rPr>
+          <w:rFonts w:ascii="Arial" w:hAnsi="Arial" w:cs="Arial"/>
+          <w:sz w:val="14"/>
+          <w:szCs w:val="14"/>
+          <w:lang w:val="es-ES"/>
+        </w:rPr>
+        <w:t xml:space="preserve"> </w:t>
+      </w:r>
+      <w:r>
+        <w:rPr>
+          <w:rFonts w:ascii="Arial" w:hAnsi="Arial" w:cs="Arial"/>
+          <w:sz w:val="14"/>
+          <w:szCs w:val="14"/>
+          <w:lang w:val="es-ES"/>
+        </w:rPr>
+        <w:t xml:space="preserve">instrumento antes relacionado </w:t>
+      </w:r>
+      <w:r>
+        <w:rPr>
+          <w:rFonts w:ascii="Arial" w:hAnsi="Arial" w:cs="Arial"/>
+          <w:sz w:val="14"/>
+          <w:szCs w:val="14"/>
+          <w:lang w:val="es-ES"/>
+        </w:rPr>
+        <w:t>se encuentra</w:t>
+      </w:r>
+      <w:r>
+        <w:rPr>
+          <w:rFonts w:ascii="Arial" w:hAnsi="Arial" w:cs="Arial"/>
+          <w:sz w:val="14"/>
+          <w:szCs w:val="14"/>
+          <w:lang w:val="es-ES"/>
+        </w:rPr>
+        <w:t xml:space="preserve"> inscrito en el Instituto de la Función Registral del Estado de México, en la Oficina Registral d</w:t>
+      </w:r>
+      <w:r>
+        <w:rPr>
+          <w:rFonts w:ascii="Arial" w:hAnsi="Arial" w:cs="Arial"/>
+          <w:sz w:val="14"/>
+          <w:szCs w:val="14"/>
+          <w:lang w:val="es-ES"/>
+        </w:rPr>
+        <w:t>e {{ oficina_registral }}</w:t>
+      </w:r>
+      <w:r>
+        <w:rPr>
+          <w:rFonts w:ascii="Arial" w:hAnsi="Arial" w:cs="Arial"/>
+          <w:sz w:val="14"/>
+          <w:szCs w:val="14"/>
+          <w:lang w:val="es-ES"/>
+        </w:rPr>
+        <w:t xml:space="preserve">, en el libro primero, sección primera, volumen número   y bajo la partida número      , en el libro segundo, sección primera, volumen número  </w:t>
       </w:r>
     </w:p>
     <w:p>
@@ -2591,180 +2415,9 @@
           <w:rFonts w:ascii="Arial" w:hAnsi="Arial" w:cs="Arial"/>
           <w:sz w:val="14"/>
           <w:szCs w:val="14"/>
-          <w:lang w:val="es-MX"/>
-        </w:rPr>
-        <w:t xml:space="preserve">-------- </w:t>
-      </w:r>
-      <w:r>
-        <w:rPr>
-          <w:rFonts w:ascii="Arial" w:hAnsi="Arial" w:cs="Arial"/>
-          <w:b/>
-          <w:sz w:val="14"/>
-          <w:szCs w:val="14"/>
           <w:lang w:val="es-ES"/>
         </w:rPr>
-        <w:t xml:space="preserve">DATOS DE </w:t>
-      </w:r>
-      <w:r>
-        <w:rPr>
-          <w:rFonts w:ascii="Arial" w:hAnsi="Arial" w:cs="Arial"/>
-          <w:b/>
-          <w:sz w:val="14"/>
-          <w:szCs w:val="14"/>
-          <w:lang w:val="es-ES"/>
-        </w:rPr>
-        <w:t>REGISTR</w:t>
-      </w:r>
-      <w:r>
-        <w:rPr>
-          <w:rFonts w:ascii="Arial" w:hAnsi="Arial" w:cs="Arial"/>
-          <w:b/>
-          <w:sz w:val="14"/>
-          <w:szCs w:val="14"/>
-          <w:lang w:val="es-ES"/>
-        </w:rPr>
-        <w:t>O</w:t>
-      </w:r>
-      <w:r>
-        <w:rPr>
-          <w:rFonts w:ascii="Arial" w:hAnsi="Arial" w:cs="Arial"/>
-          <w:sz w:val="14"/>
-          <w:szCs w:val="14"/>
-          <w:lang w:val="es-ES"/>
-        </w:rPr>
-        <w:t>. -</w:t>
-      </w:r>
-      <w:r>
-        <w:rPr>
-          <w:rFonts w:ascii="Arial" w:hAnsi="Arial" w:cs="Arial"/>
-          <w:sz w:val="14"/>
-          <w:szCs w:val="14"/>
-          <w:lang w:val="es-ES"/>
-        </w:rPr>
-        <w:t xml:space="preserve"> </w:t>
-      </w:r>
-      <w:r>
-        <w:rPr>
-          <w:rFonts w:ascii="Arial" w:hAnsi="Arial" w:cs="Arial"/>
-          <w:sz w:val="14"/>
-          <w:szCs w:val="14"/>
-          <w:lang w:val="es-ES"/>
-        </w:rPr>
-        <w:t>El</w:t>
-      </w:r>
-      <w:r>
-        <w:rPr>
-          <w:rFonts w:ascii="Arial" w:hAnsi="Arial" w:cs="Arial"/>
-          <w:sz w:val="14"/>
-          <w:szCs w:val="14"/>
-          <w:lang w:val="es-ES"/>
-        </w:rPr>
-        <w:t xml:space="preserve"> </w:t>
-      </w:r>
-      <w:r>
-        <w:rPr>
-          <w:rFonts w:ascii="Arial" w:hAnsi="Arial" w:cs="Arial"/>
-          <w:sz w:val="14"/>
-          <w:szCs w:val="14"/>
-          <w:lang w:val="es-ES"/>
-        </w:rPr>
-        <w:t xml:space="preserve">instrumento antes relacionado </w:t>
-      </w:r>
-      <w:r>
-        <w:rPr>
-          <w:rFonts w:ascii="Arial" w:hAnsi="Arial" w:cs="Arial"/>
-          <w:sz w:val="14"/>
-          <w:szCs w:val="14"/>
-          <w:lang w:val="es-ES"/>
-        </w:rPr>
-        <w:t>se encuentra</w:t>
-      </w:r>
-      <w:r>
-        <w:rPr>
-          <w:rFonts w:ascii="Arial" w:hAnsi="Arial" w:cs="Arial"/>
-          <w:sz w:val="14"/>
-          <w:szCs w:val="14"/>
-          <w:lang w:val="es-ES"/>
-        </w:rPr>
-        <w:t xml:space="preserve"> inscrito en el Instituto de la Función Registral del Estado de México, en la Oficina Registral d</w:t>
-      </w:r>
-      <w:r>
-        <w:rPr>
-          <w:rFonts w:ascii="Arial" w:hAnsi="Arial" w:cs="Arial"/>
-          <w:sz w:val="14"/>
-          <w:szCs w:val="14"/>
-          <w:lang w:val="es-ES"/>
-        </w:rPr>
-        <w:t xml:space="preserve">e </w:t>
-      </w:r>
-      <w:proofErr w:type="gramStart"/>
-      <w:r>
-        <w:rPr>
-          <w:rFonts w:ascii="Arial" w:hAnsi="Arial" w:cs="Arial"/>
-          <w:sz w:val="14"/>
-          <w:szCs w:val="14"/>
-          <w:lang w:val="es-ES"/>
-        </w:rPr>
-        <w:t>{{ oficina</w:t>
-      </w:r>
-      <w:proofErr w:type="gramEnd"/>
-      <w:r>
-        <w:rPr>
-          <w:rFonts w:ascii="Arial" w:hAnsi="Arial" w:cs="Arial"/>
-          <w:sz w:val="14"/>
-          <w:szCs w:val="14"/>
-          <w:lang w:val="es-ES"/>
-        </w:rPr>
-        <w:t>_</w:t>
-      </w:r>
-      <w:proofErr w:type="gramStart"/>
-      <w:r>
-        <w:rPr>
-          <w:rFonts w:ascii="Arial" w:hAnsi="Arial" w:cs="Arial"/>
-          <w:sz w:val="14"/>
-          <w:szCs w:val="14"/>
-          <w:lang w:val="es-ES"/>
-        </w:rPr>
-        <w:t>registral }</w:t>
-      </w:r>
-      <w:proofErr w:type="gramEnd"/>
-      <w:r>
-        <w:rPr>
-          <w:rFonts w:ascii="Arial" w:hAnsi="Arial" w:cs="Arial"/>
-          <w:sz w:val="14"/>
-          <w:szCs w:val="14"/>
-          <w:lang w:val="es-ES"/>
-        </w:rPr>
-        <w:t>}</w:t>
-      </w:r>
-      <w:r>
-        <w:rPr>
-          <w:rFonts w:ascii="Arial" w:hAnsi="Arial" w:cs="Arial"/>
-          <w:sz w:val="14"/>
-          <w:szCs w:val="14"/>
-          <w:lang w:val="es-ES"/>
-        </w:rPr>
-        <w:t xml:space="preserve">, en el libro primero, sección primera, volumen número   y bajo la partida número    </w:t>
-      </w:r>
-      <w:proofErr w:type="gramStart"/>
-      <w:r>
-        <w:rPr>
-          <w:rFonts w:ascii="Arial" w:hAnsi="Arial" w:cs="Arial"/>
-          <w:sz w:val="14"/>
-          <w:szCs w:val="14"/>
-          <w:lang w:val="es-ES"/>
-        </w:rPr>
-        <w:t xml:space="preserve">  ,</w:t>
-      </w:r>
-      <w:proofErr w:type="gramEnd"/>
-      <w:r>
-        <w:rPr>
-          <w:rFonts w:ascii="Arial" w:hAnsi="Arial" w:cs="Arial"/>
-          <w:sz w:val="14"/>
-          <w:szCs w:val="14"/>
-          <w:lang w:val="es-ES"/>
-        </w:rPr>
-        <w:t xml:space="preserve"> en el libro segundo, sección primera, volumen número  </w:t>
+        <w:t>y bajo la partida número</w:t>
       </w:r>
     </w:p>
     <w:p>
@@ -2791,7 +2444,25 @@
           <w:szCs w:val="14"/>
           <w:lang w:val="es-ES"/>
         </w:rPr>
-        <w:t>y bajo la partida número</w:t>
+        <w:t>,</w:t>
+      </w:r>
+      <w:r>
+        <w:rPr>
+          <w:rFonts w:ascii="Arial" w:hAnsi="Arial" w:cs="Arial"/>
+          <w:sz w:val="14"/>
+          <w:szCs w:val="14"/>
+          <w:lang w:val="es-ES"/>
+        </w:rPr>
+        <w:t xml:space="preserve"> </w:t>
+      </w:r>
+      <w:r>
+        <w:rPr>
+          <w:rFonts w:ascii="Arial" w:hAnsi="Arial" w:cs="Arial"/>
+          <w:sz w:val="14"/>
+          <w:szCs w:val="14"/>
+          <w:lang w:val="es-ES"/>
+        </w:rPr>
+        <w:t>el día</w:t>
       </w:r>
     </w:p>
     <w:p>
@@ -2806,6 +2477,8 @@
         <w:jc w:val="both"/>
         <w:rPr>
           <w:rFonts w:ascii="Arial" w:hAnsi="Arial" w:cs="Arial"/>
+          <w:b/>
+          <w:bCs/>
           <w:sz w:val="14"/>
           <w:szCs w:val="14"/>
           <w:lang w:val="es-ES"/>
@@ -2836,12 +2509,31 @@
           <w:szCs w:val="14"/>
           <w:lang w:val="es-ES"/>
         </w:rPr>
-        <w:t>el día</w:t>
+        <w:t xml:space="preserve">actualmente en el Folio Real Electrónico número </w:t>
+      </w:r>
+      <w:r>
+        <w:rPr>
+          <w:rFonts w:ascii="Arial" w:hAnsi="Arial" w:cs="Arial"/>
+          <w:b/>
+          <w:bCs/>
+          <w:sz w:val="14"/>
+          <w:szCs w:val="14"/>
+          <w:lang w:val="es-MX"/>
+        </w:rPr>
+        <w:t>“{{ folio_real }}”</w:t>
+      </w:r>
+      <w:r>
+        <w:rPr>
+          <w:rFonts w:ascii="Arial" w:hAnsi="Arial" w:cs="Arial"/>
+          <w:sz w:val="14"/>
+          <w:szCs w:val="14"/>
+          <w:lang w:val="es-ES"/>
+        </w:rPr>
+        <w:tab/>
       </w:r>
     </w:p>
     <w:p>
       <w:pPr>
-        <w:pStyle w:val="Sinespaciado"/>
         <w:tabs>
           <w:tab w:val="left" w:leader="hyphen" w:pos="709"/>
           <w:tab w:val="right" w:leader="hyphen" w:pos="9072"/>
@@ -2851,19 +2543,152 @@
         <w:jc w:val="both"/>
         <w:rPr>
           <w:rFonts w:ascii="Arial" w:hAnsi="Arial" w:cs="Arial"/>
-          <w:b/>
-          <w:bCs/>
-          <w:sz w:val="14"/>
-          <w:szCs w:val="14"/>
-          <w:lang w:val="es-ES"/>
-        </w:rPr>
-      </w:pPr>
-      <w:r>
-        <w:rPr>
-          <w:rFonts w:ascii="Arial" w:hAnsi="Arial" w:cs="Arial"/>
-          <w:sz w:val="14"/>
-          <w:szCs w:val="14"/>
-          <w:lang w:val="es-ES"/>
+          <w:sz w:val="14"/>
+          <w:szCs w:val="14"/>
+        </w:rPr>
+      </w:pPr>
+      <w:r>
+        <w:rPr>
+          <w:rFonts w:ascii="Arial" w:hAnsi="Arial" w:cs="Arial"/>
+          <w:sz w:val="14"/>
+          <w:szCs w:val="14"/>
+          <w:lang w:val="es-MX"/>
+        </w:rPr>
+        <w:t xml:space="preserve">-------- </w:t>
+      </w:r>
+      <w:r>
+        <w:rPr>
+          <w:rFonts w:ascii="Arial" w:hAnsi="Arial" w:cs="Arial"/>
+          <w:b/>
+          <w:sz w:val="14"/>
+          <w:szCs w:val="14"/>
+        </w:rPr>
+        <w:t>II.- CARTA DE INSTRUCCIÓN DE CANCELACIÓN DE HIPOTECA.</w:t>
+      </w:r>
+      <w:r>
+        <w:rPr>
+          <w:rFonts w:ascii="Arial" w:hAnsi="Arial" w:cs="Arial"/>
+          <w:b/>
+          <w:sz w:val="14"/>
+          <w:szCs w:val="14"/>
+        </w:rPr>
+        <w:t xml:space="preserve"> </w:t>
+      </w:r>
+      <w:r>
+        <w:rPr>
+          <w:rFonts w:ascii="Arial" w:hAnsi="Arial" w:cs="Arial"/>
+          <w:b/>
+          <w:sz w:val="14"/>
+          <w:szCs w:val="14"/>
+        </w:rPr>
+        <w:t xml:space="preserve">- </w:t>
+      </w:r>
+      <w:r>
+        <w:rPr>
+          <w:rFonts w:ascii="Arial" w:hAnsi="Arial" w:cs="Arial"/>
+          <w:sz w:val="14"/>
+          <w:szCs w:val="14"/>
+        </w:rPr>
+        <w:t>Con fech</w:t>
+      </w:r>
+      <w:r>
+        <w:rPr>
+          <w:rFonts w:ascii="Arial" w:hAnsi="Arial" w:cs="Arial"/>
+          <w:sz w:val="14"/>
+          <w:szCs w:val="14"/>
+        </w:rPr>
+        <w:t xml:space="preserve">a </w:t>
+      </w:r>
+      <w:r>
+        <w:rPr>
+          <w:rFonts w:ascii="Arial" w:hAnsi="Arial" w:cs="Arial"/>
+          <w:sz w:val="14"/>
+          <w:szCs w:val="14"/>
+        </w:rPr>
+        <w:t xml:space="preserve">{{ </w:t>
+      </w:r>
+      <w:r>
+        <w:rPr>
+          <w:rFonts w:ascii="Arial" w:hAnsi="Arial" w:cs="Arial"/>
+          <w:sz w:val="14"/>
+          <w:szCs w:val="14"/>
+        </w:rPr>
+        <w:t>fecha_expedicion</w:t>
+      </w:r>
+      <w:r>
+        <w:rPr>
+          <w:rFonts w:ascii="Arial" w:hAnsi="Arial" w:cs="Arial"/>
+          <w:sz w:val="14"/>
+          <w:szCs w:val="14"/>
+        </w:rPr>
+        <w:t xml:space="preserve"> }}</w:t>
+      </w:r>
+      <w:r>
+        <w:rPr>
+          <w:rFonts w:ascii="Arial" w:hAnsi="Arial" w:cs="Arial"/>
+          <w:sz w:val="14"/>
+          <w:szCs w:val="14"/>
+        </w:rPr>
+        <w:t xml:space="preserve">, el </w:t>
+      </w:r>
+      <w:r>
+        <w:rPr>
+          <w:rFonts w:ascii="Arial" w:hAnsi="Arial" w:cs="Arial"/>
+          <w:b/>
+          <w:sz w:val="14"/>
+          <w:szCs w:val="14"/>
+        </w:rPr>
+        <w:t xml:space="preserve">INSTITUTO DEL FONDO NACIONAL DE LA VIVIENDA PARA LOS TRABAJADORES, </w:t>
+      </w:r>
+      <w:r>
+        <w:rPr>
+          <w:rFonts w:ascii="Arial" w:hAnsi="Arial" w:cs="Arial"/>
+          <w:sz w:val="14"/>
+          <w:szCs w:val="14"/>
+        </w:rPr>
+        <w:t>giró carta</w:t>
+      </w:r>
+      <w:r>
+        <w:rPr>
+          <w:rFonts w:ascii="Arial" w:hAnsi="Arial" w:cs="Arial"/>
+          <w:sz w:val="14"/>
+          <w:szCs w:val="14"/>
+        </w:rPr>
+        <w:t xml:space="preserve"> de instrucción de cancelación de hipoteca con</w:t>
+      </w:r>
+      <w:r>
+        <w:rPr>
+          <w:rFonts w:ascii="Arial" w:hAnsi="Arial" w:cs="Arial"/>
+          <w:sz w:val="14"/>
+          <w:szCs w:val="14"/>
+        </w:rPr>
+        <w:t xml:space="preserve"> número</w:t>
+      </w:r>
+      <w:bookmarkStart w:id="5" w:name="_Hlk32404108"/>
+      <w:r>
+        <w:rPr>
+          <w:rFonts w:ascii="Arial" w:hAnsi="Arial" w:cs="Arial"/>
+          <w:sz w:val="14"/>
+          <w:szCs w:val="14"/>
+        </w:rPr>
+        <w:t xml:space="preserve"> </w:t>
+      </w:r>
+      <w:bookmarkEnd w:id="5"/>
+      <w:r>
+        <w:rPr>
+          <w:rFonts w:ascii="Arial" w:hAnsi="Arial" w:cs="Arial"/>
+          <w:b/>
+          <w:bCs/>
+          <w:sz w:val="14"/>
+          <w:szCs w:val="14"/>
+        </w:rPr>
+        <w:t>{{ numero_carta }}</w:t>
+      </w:r>
+      <w:r>
+        <w:rPr>
+          <w:rFonts w:ascii="Arial" w:hAnsi="Arial" w:cs="Arial"/>
+          <w:sz w:val="14"/>
+          <w:szCs w:val="14"/>
         </w:rPr>
         <w:t>,</w:t>
       </w:r>
@@ -2872,315 +2697,6 @@
           <w:rFonts w:ascii="Arial" w:hAnsi="Arial" w:cs="Arial"/>
           <w:sz w:val="14"/>
           <w:szCs w:val="14"/>
-          <w:lang w:val="es-ES"/>
-        </w:rPr>
-        <w:t xml:space="preserve"> </w:t>
-      </w:r>
-      <w:r>
-        <w:rPr>
-          <w:rFonts w:ascii="Arial" w:hAnsi="Arial" w:cs="Arial"/>
-          <w:sz w:val="14"/>
-          <w:szCs w:val="14"/>
-          <w:lang w:val="es-ES"/>
-        </w:rPr>
-        <w:t xml:space="preserve">actualmente en el Folio Real Electrónico número </w:t>
-      </w:r>
-      <w:r>
-        <w:rPr>
-          <w:rFonts w:ascii="Arial" w:hAnsi="Arial" w:cs="Arial"/>
-          <w:b/>
-          <w:bCs/>
-          <w:sz w:val="14"/>
-          <w:szCs w:val="14"/>
-          <w:lang w:val="es-MX"/>
-        </w:rPr>
-        <w:t>“</w:t>
-      </w:r>
-      <w:proofErr w:type="gramStart"/>
-      <w:r>
-        <w:rPr>
-          <w:rFonts w:ascii="Arial" w:hAnsi="Arial" w:cs="Arial"/>
-          <w:b/>
-          <w:bCs/>
-          <w:sz w:val="14"/>
-          <w:szCs w:val="14"/>
-          <w:lang w:val="es-MX"/>
-        </w:rPr>
-        <w:t>{{ folio</w:t>
-      </w:r>
-      <w:proofErr w:type="gramEnd"/>
-      <w:r>
-        <w:rPr>
-          <w:rFonts w:ascii="Arial" w:hAnsi="Arial" w:cs="Arial"/>
-          <w:b/>
-          <w:bCs/>
-          <w:sz w:val="14"/>
-          <w:szCs w:val="14"/>
-          <w:lang w:val="es-MX"/>
-        </w:rPr>
-        <w:t>_</w:t>
-      </w:r>
-      <w:proofErr w:type="gramStart"/>
-      <w:r>
-        <w:rPr>
-          <w:rFonts w:ascii="Arial" w:hAnsi="Arial" w:cs="Arial"/>
-          <w:b/>
-          <w:bCs/>
-          <w:sz w:val="14"/>
-          <w:szCs w:val="14"/>
-          <w:lang w:val="es-MX"/>
-        </w:rPr>
-        <w:t>real }</w:t>
-      </w:r>
-      <w:proofErr w:type="gramEnd"/>
-      <w:r>
-        <w:rPr>
-          <w:rFonts w:ascii="Arial" w:hAnsi="Arial" w:cs="Arial"/>
-          <w:b/>
-          <w:bCs/>
-          <w:sz w:val="14"/>
-          <w:szCs w:val="14"/>
-          <w:lang w:val="es-MX"/>
-        </w:rPr>
-        <w:t>}”</w:t>
-      </w:r>
-      <w:r>
-        <w:rPr>
-          <w:rFonts w:ascii="Arial" w:hAnsi="Arial" w:cs="Arial"/>
-          <w:sz w:val="14"/>
-          <w:szCs w:val="14"/>
-          <w:lang w:val="es-ES"/>
-        </w:rPr>
-        <w:tab/>
-      </w:r>
-    </w:p>
-    <w:p>
-      <w:pPr>
-        <w:tabs>
-          <w:tab w:val="left" w:leader="hyphen" w:pos="709"/>
-          <w:tab w:val="right" w:leader="hyphen" w:pos="9072"/>
-          <w:tab w:val="right" w:leader="hyphen" w:pos="9129"/>
-        </w:tabs>
-        <w:spacing w:line="360" w:lineRule="auto"/>
-        <w:jc w:val="both"/>
-        <w:rPr>
-          <w:rFonts w:ascii="Arial" w:hAnsi="Arial" w:cs="Arial"/>
-          <w:sz w:val="14"/>
-          <w:szCs w:val="14"/>
-        </w:rPr>
-      </w:pPr>
-      <w:r>
-        <w:rPr>
-          <w:rFonts w:ascii="Arial" w:hAnsi="Arial" w:cs="Arial"/>
-          <w:sz w:val="14"/>
-          <w:szCs w:val="14"/>
-          <w:lang w:val="es-MX"/>
-        </w:rPr>
-        <w:t xml:space="preserve">-------- </w:t>
-      </w:r>
-      <w:r>
-        <w:rPr>
-          <w:rFonts w:ascii="Arial" w:hAnsi="Arial" w:cs="Arial"/>
-          <w:b/>
-          <w:sz w:val="14"/>
-          <w:szCs w:val="14"/>
-        </w:rPr>
-        <w:t>II.- CARTA DE INSTRUCCIÓN DE CANCELACIÓN DE HIPOTECA.</w:t>
-      </w:r>
-      <w:r>
-        <w:rPr>
-          <w:rFonts w:ascii="Arial" w:hAnsi="Arial" w:cs="Arial"/>
-          <w:b/>
-          <w:sz w:val="14"/>
-          <w:szCs w:val="14"/>
-        </w:rPr>
-        <w:t xml:space="preserve"> </w:t>
-      </w:r>
-      <w:r>
-        <w:rPr>
-          <w:rFonts w:ascii="Arial" w:hAnsi="Arial" w:cs="Arial"/>
-          <w:b/>
-          <w:sz w:val="14"/>
-          <w:szCs w:val="14"/>
-        </w:rPr>
-        <w:t xml:space="preserve">- </w:t>
-      </w:r>
-      <w:r>
-        <w:rPr>
-          <w:rFonts w:ascii="Arial" w:hAnsi="Arial" w:cs="Arial"/>
-          <w:sz w:val="14"/>
-          <w:szCs w:val="14"/>
-        </w:rPr>
-        <w:t>Con fech</w:t>
-      </w:r>
-      <w:r>
-        <w:rPr>
-          <w:rFonts w:ascii="Arial" w:hAnsi="Arial" w:cs="Arial"/>
-          <w:sz w:val="14"/>
-          <w:szCs w:val="14"/>
-        </w:rPr>
-        <w:t xml:space="preserve">a </w:t>
-      </w:r>
-      <w:proofErr w:type="gramStart"/>
-      <w:r>
-        <w:rPr>
-          <w:rFonts w:ascii="Arial" w:hAnsi="Arial" w:cs="Arial"/>
-          <w:sz w:val="14"/>
-          <w:szCs w:val="14"/>
-        </w:rPr>
-        <w:t xml:space="preserve">{{ </w:t>
-      </w:r>
-      <w:r>
-        <w:rPr>
-          <w:rFonts w:ascii="Arial" w:hAnsi="Arial" w:cs="Arial"/>
-          <w:sz w:val="14"/>
-          <w:szCs w:val="14"/>
-        </w:rPr>
-        <w:t>fecha</w:t>
-      </w:r>
-      <w:proofErr w:type="gramEnd"/>
-      <w:r>
-        <w:rPr>
-          <w:rFonts w:ascii="Arial" w:hAnsi="Arial" w:cs="Arial"/>
-          <w:sz w:val="14"/>
-          <w:szCs w:val="14"/>
-        </w:rPr>
-        <w:t>_</w:t>
-      </w:r>
-      <w:proofErr w:type="gramStart"/>
-      <w:r>
-        <w:rPr>
-          <w:rFonts w:ascii="Arial" w:hAnsi="Arial" w:cs="Arial"/>
-          <w:sz w:val="14"/>
-          <w:szCs w:val="14"/>
-        </w:rPr>
-        <w:t>expedicion</w:t>
-      </w:r>
-      <w:r>
-        <w:rPr>
-          <w:rFonts w:ascii="Arial" w:hAnsi="Arial" w:cs="Arial"/>
-          <w:sz w:val="14"/>
-          <w:szCs w:val="14"/>
-        </w:rPr>
-        <w:t xml:space="preserve"> }</w:t>
-      </w:r>
-      <w:proofErr w:type="gramEnd"/>
-      <w:r>
-        <w:rPr>
-          <w:rFonts w:ascii="Arial" w:hAnsi="Arial" w:cs="Arial"/>
-          <w:sz w:val="14"/>
-          <w:szCs w:val="14"/>
-        </w:rPr>
-        <w:t>}</w:t>
-      </w:r>
-      <w:r>
-        <w:rPr>
-          <w:rFonts w:ascii="Arial" w:hAnsi="Arial" w:cs="Arial"/>
-          <w:sz w:val="14"/>
-          <w:szCs w:val="14"/>
-        </w:rPr>
-        <w:t xml:space="preserve">, el </w:t>
-      </w:r>
-      <w:r>
-        <w:rPr>
-          <w:rFonts w:ascii="Arial" w:hAnsi="Arial" w:cs="Arial"/>
-          <w:b/>
-          <w:sz w:val="14"/>
-          <w:szCs w:val="14"/>
-        </w:rPr>
-        <w:t xml:space="preserve">INSTITUTO DEL FONDO NACIONAL DE LA VIVIENDA PARA LOS TRABAJADORES, </w:t>
-      </w:r>
-      <w:r>
-        <w:rPr>
-          <w:rFonts w:ascii="Arial" w:hAnsi="Arial" w:cs="Arial"/>
-          <w:sz w:val="14"/>
-          <w:szCs w:val="14"/>
-        </w:rPr>
-        <w:t>giró carta</w:t>
-      </w:r>
-      <w:r>
-        <w:rPr>
-          <w:rFonts w:ascii="Arial" w:hAnsi="Arial" w:cs="Arial"/>
-          <w:sz w:val="14"/>
-          <w:szCs w:val="14"/>
-        </w:rPr>
-        <w:t xml:space="preserve"> de instrucción de cancelación de hipoteca con</w:t>
-      </w:r>
-      <w:r>
-        <w:rPr>
-          <w:rFonts w:ascii="Arial" w:hAnsi="Arial" w:cs="Arial"/>
-          <w:sz w:val="14"/>
-          <w:szCs w:val="14"/>
-        </w:rPr>
-        <w:t xml:space="preserve"> número</w:t>
-      </w:r>
-      <w:bookmarkStart w:id="5" w:name="_Hlk32404108"/>
-      <w:r>
-        <w:rPr>
-          <w:rFonts w:ascii="Arial" w:hAnsi="Arial" w:cs="Arial"/>
-          <w:sz w:val="14"/>
-          <w:szCs w:val="14"/>
-        </w:rPr>
-        <w:t xml:space="preserve"> </w:t>
-      </w:r>
-      <w:bookmarkEnd w:id="5"/>
-      <w:proofErr w:type="gramStart"/>
-      <w:r>
-        <w:rPr>
-          <w:rFonts w:ascii="Arial" w:hAnsi="Arial" w:cs="Arial"/>
-          <w:b/>
-          <w:bCs/>
-          <w:sz w:val="14"/>
-          <w:szCs w:val="14"/>
-        </w:rPr>
-        <w:t>{{ numero</w:t>
-      </w:r>
-      <w:proofErr w:type="gramEnd"/>
-      <w:r>
-        <w:rPr>
-          <w:rFonts w:ascii="Arial" w:hAnsi="Arial" w:cs="Arial"/>
-          <w:b/>
-          <w:bCs/>
-          <w:sz w:val="14"/>
-          <w:szCs w:val="14"/>
-        </w:rPr>
-        <w:t>_</w:t>
-      </w:r>
-      <w:proofErr w:type="gramStart"/>
-      <w:r>
-        <w:rPr>
-          <w:rFonts w:ascii="Arial" w:hAnsi="Arial" w:cs="Arial"/>
-          <w:b/>
-          <w:bCs/>
-          <w:sz w:val="14"/>
-          <w:szCs w:val="14"/>
-        </w:rPr>
-        <w:t>carta }</w:t>
-      </w:r>
-      <w:proofErr w:type="gramEnd"/>
-      <w:r>
-        <w:rPr>
-          <w:rFonts w:ascii="Arial" w:hAnsi="Arial" w:cs="Arial"/>
-          <w:b/>
-          <w:bCs/>
-          <w:sz w:val="14"/>
-          <w:szCs w:val="14"/>
-        </w:rPr>
-        <w:t>}</w:t>
-      </w:r>
-      <w:r>
-        <w:rPr>
-          <w:rFonts w:ascii="Arial" w:hAnsi="Arial" w:cs="Arial"/>
-          <w:sz w:val="14"/>
-          <w:szCs w:val="14"/>
-        </w:rPr>
-        <w:t>,</w:t>
-      </w:r>
-      <w:r>
-        <w:rPr>
-          <w:rFonts w:ascii="Arial" w:hAnsi="Arial" w:cs="Arial"/>
-          <w:sz w:val="14"/>
-          <w:szCs w:val="14"/>
         </w:rPr>
         <w:t xml:space="preserve"> </w:t>
       </w:r>
@@ -3324,49 +2840,15 @@
         </w:rPr>
         <w:t xml:space="preserve"> </w:t>
       </w:r>
-      <w:proofErr w:type="gramStart"/>
-      <w:r>
-        <w:rPr>
-          <w:rFonts w:ascii="Arial" w:hAnsi="Arial" w:cs="Arial"/>
-          <w:b/>
-          <w:bCs/>
-          <w:sz w:val="14"/>
-          <w:szCs w:val="14"/>
-        </w:rPr>
-        <w:t>{{ fecha</w:t>
-      </w:r>
-      <w:proofErr w:type="gramEnd"/>
-      <w:r>
-        <w:rPr>
-          <w:rFonts w:ascii="Arial" w:hAnsi="Arial" w:cs="Arial"/>
-          <w:b/>
-          <w:bCs/>
-          <w:sz w:val="14"/>
-          <w:szCs w:val="14"/>
-        </w:rPr>
-        <w:t>_</w:t>
-      </w:r>
-      <w:proofErr w:type="gramStart"/>
-      <w:r>
-        <w:rPr>
-          <w:rFonts w:ascii="Arial" w:hAnsi="Arial" w:cs="Arial"/>
-          <w:b/>
-          <w:bCs/>
-          <w:sz w:val="14"/>
-          <w:szCs w:val="14"/>
-        </w:rPr>
-        <w:t>liquidacion }</w:t>
-      </w:r>
-      <w:proofErr w:type="gramEnd"/>
-      <w:r>
-        <w:rPr>
-          <w:rFonts w:ascii="Arial" w:hAnsi="Arial" w:cs="Arial"/>
-          <w:b/>
-          <w:bCs/>
-          <w:sz w:val="14"/>
-          <w:szCs w:val="14"/>
-        </w:rPr>
-        <w:t>}</w:t>
+      <w:r>
+        <w:rPr>
+          <w:rFonts w:ascii="Arial" w:hAnsi="Arial" w:cs="Arial"/>
+          <w:b/>
+          <w:bCs/>
+          <w:sz w:val="14"/>
+          <w:szCs w:val="14"/>
+        </w:rPr>
+        <w:t>{{ fecha_liquidacion }}</w:t>
       </w:r>
     </w:p>
     <w:p>
@@ -5185,7 +4667,6 @@
           <w:szCs w:val="14"/>
           <w:lang w:val="es-MX"/>
         </w:rPr>
-        <w:lastRenderedPageBreak/>
         <w:t xml:space="preserve">-------- </w:t>
       </w:r>
       <w:r>
@@ -5228,6 +4709,7 @@
           <w:szCs w:val="14"/>
           <w:lang w:val="es-MX"/>
         </w:rPr>
+        <w:lastRenderedPageBreak/>
         <w:t xml:space="preserve">-------- </w:t>
       </w:r>
       <w:r>
@@ -5556,7 +5038,6 @@
         </w:rPr>
         <w:t xml:space="preserve">-------- </w:t>
       </w:r>
-      <w:proofErr w:type="gramStart"/>
       <w:r>
         <w:rPr>
           <w:rFonts w:ascii="Arial" w:eastAsia="MS Mincho" w:hAnsi="Arial" w:cs="Arial"/>
@@ -5564,17 +5045,7 @@
           <w:szCs w:val="14"/>
           <w:lang w:val="es-MX"/>
         </w:rPr>
-        <w:t>VI.-</w:t>
-      </w:r>
-      <w:proofErr w:type="gramEnd"/>
-      <w:r>
-        <w:rPr>
-          <w:rFonts w:ascii="Arial" w:eastAsia="MS Mincho" w:hAnsi="Arial" w:cs="Arial"/>
-          <w:sz w:val="14"/>
-          <w:szCs w:val="14"/>
-          <w:lang w:val="es-MX"/>
-        </w:rPr>
-        <w:t xml:space="preserve"> Que leí este instrumento a la compareciente, a quien le expliqué su valor, fuerza y las consecuencias legales de su contenido, manifestando su conformidad con el mismo, por lo que lo otorga, ratifica y </w:t>
+        <w:t xml:space="preserve">VI.- Que leí este instrumento a la compareciente, a quien le expliqué su valor, fuerza y las consecuencias legales de su contenido, manifestando su conformidad con el mismo, por lo que lo otorga, ratifica y </w:t>
       </w:r>
       <w:r>
         <w:rPr>
@@ -6550,7 +6021,6 @@
         </w:rPr>
         <w:t xml:space="preserve"> </w:t>
       </w:r>
-      <w:proofErr w:type="gramStart"/>
       <w:r>
         <w:rPr>
           <w:rFonts w:ascii="Arial" w:hAnsi="Arial" w:cs="Arial"/>
@@ -6559,40 +6029,7 @@
           <w:szCs w:val="14"/>
           <w:u w:val="single"/>
         </w:rPr>
-        <w:t>{{ nombre</w:t>
-      </w:r>
-      <w:proofErr w:type="gramEnd"/>
-      <w:r>
-        <w:rPr>
-          <w:rFonts w:ascii="Arial" w:hAnsi="Arial" w:cs="Arial"/>
-          <w:b/>
-          <w:sz w:val="14"/>
-          <w:szCs w:val="14"/>
-          <w:u w:val="single"/>
-        </w:rPr>
-        <w:t>_</w:t>
-      </w:r>
-      <w:proofErr w:type="gramStart"/>
-      <w:r>
-        <w:rPr>
-          <w:rFonts w:ascii="Arial" w:hAnsi="Arial" w:cs="Arial"/>
-          <w:b/>
-          <w:sz w:val="14"/>
-          <w:szCs w:val="14"/>
-          <w:u w:val="single"/>
-        </w:rPr>
-        <w:t>acreditado }</w:t>
-      </w:r>
-      <w:proofErr w:type="gramEnd"/>
-      <w:r>
-        <w:rPr>
-          <w:rFonts w:ascii="Arial" w:hAnsi="Arial" w:cs="Arial"/>
-          <w:b/>
-          <w:sz w:val="14"/>
-          <w:szCs w:val="14"/>
-          <w:u w:val="single"/>
-        </w:rPr>
-        <w:t>}</w:t>
+        <w:t>{{ nombre_acreditado }}</w:t>
       </w:r>
       <w:r>
         <w:rPr>

</xml_diff>

<commit_message>
Se agrego una vista previa de el documento word a el inicio.
</commit_message>
<xml_diff>
--- a/backend/templates/plantilla_manera2.docx
+++ b/backend/templates/plantilla_manera2.docx
@@ -549,6 +549,7 @@
         </w:rPr>
         <w:t xml:space="preserve">A FAVOR DE LA SEÑORA </w:t>
       </w:r>
+      <w:proofErr w:type="gramStart"/>
       <w:r>
         <w:rPr>
           <w:rFonts w:ascii="Arial" w:hAnsi="Arial" w:cs="Arial"/>
@@ -557,7 +558,62 @@
           <w:szCs w:val="14"/>
           <w:lang w:val="es-MX"/>
         </w:rPr>
-        <w:t>{{ nombre_acreditado }}</w:t>
+        <w:t xml:space="preserve">{{ </w:t>
+      </w:r>
+      <w:proofErr w:type="spellStart"/>
+      <w:r>
+        <w:rPr>
+          <w:rFonts w:ascii="Arial" w:hAnsi="Arial" w:cs="Arial"/>
+          <w:b/>
+          <w:sz w:val="14"/>
+          <w:szCs w:val="14"/>
+          <w:lang w:val="es-MX"/>
+        </w:rPr>
+        <w:t>nombre</w:t>
+      </w:r>
+      <w:proofErr w:type="gramEnd"/>
+      <w:r>
+        <w:rPr>
+          <w:rFonts w:ascii="Arial" w:hAnsi="Arial" w:cs="Arial"/>
+          <w:b/>
+          <w:sz w:val="14"/>
+          <w:szCs w:val="14"/>
+          <w:lang w:val="es-MX"/>
+        </w:rPr>
+        <w:t>_</w:t>
+      </w:r>
+      <w:proofErr w:type="gramStart"/>
+      <w:r>
+        <w:rPr>
+          <w:rFonts w:ascii="Arial" w:hAnsi="Arial" w:cs="Arial"/>
+          <w:b/>
+          <w:sz w:val="14"/>
+          <w:szCs w:val="14"/>
+          <w:lang w:val="es-MX"/>
+        </w:rPr>
+        <w:t>acreditado</w:t>
+      </w:r>
+      <w:proofErr w:type="spellEnd"/>
+      <w:r>
+        <w:rPr>
+          <w:rFonts w:ascii="Arial" w:hAnsi="Arial" w:cs="Arial"/>
+          <w:b/>
+          <w:sz w:val="14"/>
+          <w:szCs w:val="14"/>
+          <w:lang w:val="es-MX"/>
+        </w:rPr>
+        <w:t xml:space="preserve"> }</w:t>
+      </w:r>
+      <w:proofErr w:type="gramEnd"/>
+      <w:r>
+        <w:rPr>
+          <w:rFonts w:ascii="Arial" w:hAnsi="Arial" w:cs="Arial"/>
+          <w:b/>
+          <w:sz w:val="14"/>
+          <w:szCs w:val="14"/>
+          <w:lang w:val="es-MX"/>
+        </w:rPr>
+        <w:t>}</w:t>
       </w:r>
       <w:r>
         <w:rPr>
@@ -1399,7 +1455,31 @@
           <w:szCs w:val="14"/>
           <w:lang w:val="es-MX"/>
         </w:rPr>
-        <w:t>{{ numero_carta }}</w:t>
+        <w:t xml:space="preserve">{{ </w:t>
+      </w:r>
+      <w:proofErr w:type="spellStart"/>
+      <w:r>
+        <w:rPr>
+          <w:rFonts w:ascii="Arial" w:eastAsia="Batang" w:hAnsi="Arial" w:cs="Arial"/>
+          <w:b/>
+          <w:bCs/>
+          <w:sz w:val="14"/>
+          <w:szCs w:val="14"/>
+          <w:lang w:val="es-MX"/>
+        </w:rPr>
+        <w:t>numero_carta</w:t>
+      </w:r>
+      <w:proofErr w:type="spellEnd"/>
+      <w:r>
+        <w:rPr>
+          <w:rFonts w:ascii="Arial" w:eastAsia="Batang" w:hAnsi="Arial" w:cs="Arial"/>
+          <w:b/>
+          <w:bCs/>
+          <w:sz w:val="14"/>
+          <w:szCs w:val="14"/>
+          <w:lang w:val="es-MX"/>
+        </w:rPr>
+        <w:t xml:space="preserve"> }}</w:t>
       </w:r>
       <w:r>
         <w:rPr>
@@ -1440,8 +1520,9 @@
           <w:szCs w:val="14"/>
           <w:lang w:val="es-MX"/>
         </w:rPr>
-        <w:t>{{ fecha</w:t>
-      </w:r>
+        <w:t xml:space="preserve">{{ </w:t>
+      </w:r>
+      <w:proofErr w:type="spellStart"/>
       <w:r>
         <w:rPr>
           <w:rFonts w:ascii="Arial" w:eastAsia="Batang" w:hAnsi="Arial" w:cs="Arial"/>
@@ -1449,8 +1530,18 @@
           <w:szCs w:val="14"/>
           <w:lang w:val="es-MX"/>
         </w:rPr>
+        <w:t>fecha</w:t>
+      </w:r>
+      <w:r>
+        <w:rPr>
+          <w:rFonts w:ascii="Arial" w:eastAsia="Batang" w:hAnsi="Arial" w:cs="Arial"/>
+          <w:sz w:val="14"/>
+          <w:szCs w:val="14"/>
+          <w:lang w:val="es-MX"/>
+        </w:rPr>
         <w:t>_expedicion</w:t>
       </w:r>
+      <w:proofErr w:type="spellEnd"/>
       <w:r>
         <w:rPr>
           <w:rFonts w:ascii="Arial" w:eastAsia="Batang" w:hAnsi="Arial" w:cs="Arial"/>
@@ -1513,7 +1604,29 @@
           <w:szCs w:val="14"/>
           <w:lang w:val="es-MX"/>
         </w:rPr>
-        <w:t>{{ nombre_notario }}</w:t>
+        <w:t xml:space="preserve">{{ </w:t>
+      </w:r>
+      <w:proofErr w:type="spellStart"/>
+      <w:r>
+        <w:rPr>
+          <w:rFonts w:ascii="Arial" w:eastAsia="Batang" w:hAnsi="Arial" w:cs="Arial"/>
+          <w:bCs/>
+          <w:sz w:val="14"/>
+          <w:szCs w:val="14"/>
+          <w:lang w:val="es-MX"/>
+        </w:rPr>
+        <w:t>nombre_notario</w:t>
+      </w:r>
+      <w:proofErr w:type="spellEnd"/>
+      <w:r>
+        <w:rPr>
+          <w:rFonts w:ascii="Arial" w:eastAsia="Batang" w:hAnsi="Arial" w:cs="Arial"/>
+          <w:bCs/>
+          <w:sz w:val="14"/>
+          <w:szCs w:val="14"/>
+          <w:lang w:val="es-MX"/>
+        </w:rPr>
+        <w:t xml:space="preserve"> }}</w:t>
       </w:r>
       <w:r>
         <w:rPr>
@@ -1734,7 +1847,29 @@
           <w:szCs w:val="14"/>
           <w:lang w:val="es-MX"/>
         </w:rPr>
-        <w:t>{{ nombre_acreditado }}</w:t>
+        <w:t xml:space="preserve">{{ </w:t>
+      </w:r>
+      <w:proofErr w:type="spellStart"/>
+      <w:r>
+        <w:rPr>
+          <w:rFonts w:ascii="Arial" w:hAnsi="Arial" w:cs="Arial"/>
+          <w:b/>
+          <w:sz w:val="14"/>
+          <w:szCs w:val="14"/>
+          <w:lang w:val="es-MX"/>
+        </w:rPr>
+        <w:t>nombre_acreditado</w:t>
+      </w:r>
+      <w:proofErr w:type="spellEnd"/>
+      <w:r>
+        <w:rPr>
+          <w:rFonts w:ascii="Arial" w:hAnsi="Arial" w:cs="Arial"/>
+          <w:b/>
+          <w:sz w:val="14"/>
+          <w:szCs w:val="14"/>
+          <w:lang w:val="es-MX"/>
+        </w:rPr>
+        <w:t xml:space="preserve"> }}</w:t>
       </w:r>
       <w:r>
         <w:rPr>
@@ -1784,7 +1919,25 @@
           <w:sz w:val="14"/>
           <w:szCs w:val="14"/>
         </w:rPr>
-        <w:t xml:space="preserve"> {{ crédito_a_salario }}</w:t>
+        <w:t xml:space="preserve"> {{ </w:t>
+      </w:r>
+      <w:proofErr w:type="spellStart"/>
+      <w:r>
+        <w:rPr>
+          <w:rFonts w:ascii="Arial" w:eastAsia="Batang" w:hAnsi="Arial" w:cs="Arial"/>
+          <w:sz w:val="14"/>
+          <w:szCs w:val="14"/>
+        </w:rPr>
+        <w:t>crédito_a_salario</w:t>
+      </w:r>
+      <w:proofErr w:type="spellEnd"/>
+      <w:r>
+        <w:rPr>
+          <w:rFonts w:ascii="Arial" w:eastAsia="Batang" w:hAnsi="Arial" w:cs="Arial"/>
+          <w:sz w:val="14"/>
+          <w:szCs w:val="14"/>
+        </w:rPr>
+        <w:t xml:space="preserve"> }}</w:t>
       </w:r>
       <w:r>
         <w:rPr>
@@ -1840,7 +1993,31 @@
           <w:sz w:val="14"/>
           <w:szCs w:val="14"/>
         </w:rPr>
-        <w:t>{{ monto_credito }}</w:t>
+        <w:t xml:space="preserve">{{ </w:t>
+      </w:r>
+      <w:proofErr w:type="spellStart"/>
+      <w:r>
+        <w:rPr>
+          <w:rFonts w:ascii="Arial" w:eastAsia="Batang" w:hAnsi="Arial" w:cs="Arial"/>
+          <w:b/>
+          <w:bCs/>
+          <w:iCs/>
+          <w:sz w:val="14"/>
+          <w:szCs w:val="14"/>
+        </w:rPr>
+        <w:t>monto_credito</w:t>
+      </w:r>
+      <w:proofErr w:type="spellEnd"/>
+      <w:r>
+        <w:rPr>
+          <w:rFonts w:ascii="Arial" w:eastAsia="Batang" w:hAnsi="Arial" w:cs="Arial"/>
+          <w:b/>
+          <w:bCs/>
+          <w:iCs/>
+          <w:sz w:val="14"/>
+          <w:szCs w:val="14"/>
+        </w:rPr>
+        <w:t xml:space="preserve"> }}</w:t>
       </w:r>
       <w:r>
         <w:rPr>
@@ -2121,6 +2298,7 @@
         </w:rPr>
         <w:t xml:space="preserve"> </w:t>
       </w:r>
+      <w:proofErr w:type="gramStart"/>
       <w:r>
         <w:rPr>
           <w:rFonts w:ascii="Arial" w:eastAsia="Batang" w:hAnsi="Arial" w:cs="Arial"/>
@@ -2130,7 +2308,67 @@
           <w:szCs w:val="14"/>
           <w:lang w:val="es-MX"/>
         </w:rPr>
-        <w:t>{{ datos_inmueble }}</w:t>
+        <w:t xml:space="preserve">{{ </w:t>
+      </w:r>
+      <w:proofErr w:type="spellStart"/>
+      <w:r>
+        <w:rPr>
+          <w:rFonts w:ascii="Arial" w:eastAsia="Batang" w:hAnsi="Arial" w:cs="Arial"/>
+          <w:b/>
+          <w:bCs/>
+          <w:sz w:val="14"/>
+          <w:szCs w:val="14"/>
+          <w:lang w:val="es-MX"/>
+        </w:rPr>
+        <w:t>datos</w:t>
+      </w:r>
+      <w:proofErr w:type="gramEnd"/>
+      <w:r>
+        <w:rPr>
+          <w:rFonts w:ascii="Arial" w:eastAsia="Batang" w:hAnsi="Arial" w:cs="Arial"/>
+          <w:b/>
+          <w:bCs/>
+          <w:sz w:val="14"/>
+          <w:szCs w:val="14"/>
+          <w:lang w:val="es-MX"/>
+        </w:rPr>
+        <w:t>_</w:t>
+      </w:r>
+      <w:proofErr w:type="gramStart"/>
+      <w:r>
+        <w:rPr>
+          <w:rFonts w:ascii="Arial" w:eastAsia="Batang" w:hAnsi="Arial" w:cs="Arial"/>
+          <w:b/>
+          <w:bCs/>
+          <w:sz w:val="14"/>
+          <w:szCs w:val="14"/>
+          <w:lang w:val="es-MX"/>
+        </w:rPr>
+        <w:t>inmueble</w:t>
+      </w:r>
+      <w:proofErr w:type="spellEnd"/>
+      <w:r>
+        <w:rPr>
+          <w:rFonts w:ascii="Arial" w:eastAsia="Batang" w:hAnsi="Arial" w:cs="Arial"/>
+          <w:b/>
+          <w:bCs/>
+          <w:sz w:val="14"/>
+          <w:szCs w:val="14"/>
+          <w:lang w:val="es-MX"/>
+        </w:rPr>
+        <w:t xml:space="preserve"> }</w:t>
+      </w:r>
+      <w:proofErr w:type="gramEnd"/>
+      <w:r>
+        <w:rPr>
+          <w:rFonts w:ascii="Arial" w:eastAsia="Batang" w:hAnsi="Arial" w:cs="Arial"/>
+          <w:b/>
+          <w:bCs/>
+          <w:sz w:val="14"/>
+          <w:szCs w:val="14"/>
+          <w:lang w:val="es-MX"/>
+        </w:rPr>
+        <w:t>}</w:t>
       </w:r>
       <w:r>
         <w:rPr>
@@ -2381,8 +2619,9 @@
           <w:szCs w:val="14"/>
           <w:lang w:val="es-ES"/>
         </w:rPr>
-        <w:t>e {{ oficina_registral }}</w:t>
-      </w:r>
+        <w:t xml:space="preserve">e </w:t>
+      </w:r>
+      <w:proofErr w:type="gramStart"/>
       <w:r>
         <w:rPr>
           <w:rFonts w:ascii="Arial" w:hAnsi="Arial" w:cs="Arial"/>
@@ -2390,7 +2629,86 @@
           <w:szCs w:val="14"/>
           <w:lang w:val="es-ES"/>
         </w:rPr>
-        <w:t xml:space="preserve">, en el libro primero, sección primera, volumen número   y bajo la partida número      , en el libro segundo, sección primera, volumen número  </w:t>
+        <w:t xml:space="preserve">{{ </w:t>
+      </w:r>
+      <w:proofErr w:type="spellStart"/>
+      <w:r>
+        <w:rPr>
+          <w:rFonts w:ascii="Arial" w:hAnsi="Arial" w:cs="Arial"/>
+          <w:sz w:val="14"/>
+          <w:szCs w:val="14"/>
+          <w:lang w:val="es-ES"/>
+        </w:rPr>
+        <w:t>oficina</w:t>
+      </w:r>
+      <w:proofErr w:type="gramEnd"/>
+      <w:r>
+        <w:rPr>
+          <w:rFonts w:ascii="Arial" w:hAnsi="Arial" w:cs="Arial"/>
+          <w:sz w:val="14"/>
+          <w:szCs w:val="14"/>
+          <w:lang w:val="es-ES"/>
+        </w:rPr>
+        <w:t>_</w:t>
+      </w:r>
+      <w:proofErr w:type="gramStart"/>
+      <w:r>
+        <w:rPr>
+          <w:rFonts w:ascii="Arial" w:hAnsi="Arial" w:cs="Arial"/>
+          <w:sz w:val="14"/>
+          <w:szCs w:val="14"/>
+          <w:lang w:val="es-ES"/>
+        </w:rPr>
+        <w:t>registral</w:t>
+      </w:r>
+      <w:proofErr w:type="spellEnd"/>
+      <w:r>
+        <w:rPr>
+          <w:rFonts w:ascii="Arial" w:hAnsi="Arial" w:cs="Arial"/>
+          <w:sz w:val="14"/>
+          <w:szCs w:val="14"/>
+          <w:lang w:val="es-ES"/>
+        </w:rPr>
+        <w:t xml:space="preserve"> }</w:t>
+      </w:r>
+      <w:proofErr w:type="gramEnd"/>
+      <w:r>
+        <w:rPr>
+          <w:rFonts w:ascii="Arial" w:hAnsi="Arial" w:cs="Arial"/>
+          <w:sz w:val="14"/>
+          <w:szCs w:val="14"/>
+          <w:lang w:val="es-ES"/>
+        </w:rPr>
+        <w:t>}</w:t>
+      </w:r>
+      <w:r>
+        <w:rPr>
+          <w:rFonts w:ascii="Arial" w:hAnsi="Arial" w:cs="Arial"/>
+          <w:sz w:val="14"/>
+          <w:szCs w:val="14"/>
+          <w:lang w:val="es-ES"/>
+        </w:rPr>
+        <w:t xml:space="preserve">, en el libro primero, sección primera, volumen número   y bajo la partida número    </w:t>
+      </w:r>
+      <w:proofErr w:type="gramStart"/>
+      <w:r>
+        <w:rPr>
+          <w:rFonts w:ascii="Arial" w:hAnsi="Arial" w:cs="Arial"/>
+          <w:sz w:val="14"/>
+          <w:szCs w:val="14"/>
+          <w:lang w:val="es-ES"/>
+        </w:rPr>
+        <w:t xml:space="preserve">  ,</w:t>
+      </w:r>
+      <w:proofErr w:type="gramEnd"/>
+      <w:r>
+        <w:rPr>
+          <w:rFonts w:ascii="Arial" w:hAnsi="Arial" w:cs="Arial"/>
+          <w:sz w:val="14"/>
+          <w:szCs w:val="14"/>
+          <w:lang w:val="es-ES"/>
+        </w:rPr>
+        <w:t xml:space="preserve"> en el libro segundo, sección primera, volumen número  </w:t>
       </w:r>
     </w:p>
     <w:p>
@@ -2520,7 +2838,79 @@
           <w:szCs w:val="14"/>
           <w:lang w:val="es-MX"/>
         </w:rPr>
-        <w:t>“{{ folio_real }}”</w:t>
+        <w:t>“</w:t>
+      </w:r>
+      <w:proofErr w:type="gramStart"/>
+      <w:r>
+        <w:rPr>
+          <w:rFonts w:ascii="Arial" w:hAnsi="Arial" w:cs="Arial"/>
+          <w:b/>
+          <w:bCs/>
+          <w:sz w:val="14"/>
+          <w:szCs w:val="14"/>
+          <w:lang w:val="es-MX"/>
+        </w:rPr>
+        <w:t xml:space="preserve">{{ </w:t>
+      </w:r>
+      <w:proofErr w:type="spellStart"/>
+      <w:r>
+        <w:rPr>
+          <w:rFonts w:ascii="Arial" w:hAnsi="Arial" w:cs="Arial"/>
+          <w:b/>
+          <w:bCs/>
+          <w:sz w:val="14"/>
+          <w:szCs w:val="14"/>
+          <w:lang w:val="es-MX"/>
+        </w:rPr>
+        <w:t>folio</w:t>
+      </w:r>
+      <w:proofErr w:type="gramEnd"/>
+      <w:r>
+        <w:rPr>
+          <w:rFonts w:ascii="Arial" w:hAnsi="Arial" w:cs="Arial"/>
+          <w:b/>
+          <w:bCs/>
+          <w:sz w:val="14"/>
+          <w:szCs w:val="14"/>
+          <w:lang w:val="es-MX"/>
+        </w:rPr>
+        <w:t>_</w:t>
+      </w:r>
+      <w:proofErr w:type="gramStart"/>
+      <w:r>
+        <w:rPr>
+          <w:rFonts w:ascii="Arial" w:hAnsi="Arial" w:cs="Arial"/>
+          <w:b/>
+          <w:bCs/>
+          <w:sz w:val="14"/>
+          <w:szCs w:val="14"/>
+          <w:lang w:val="es-MX"/>
+        </w:rPr>
+        <w:t>real</w:t>
+      </w:r>
+      <w:proofErr w:type="spellEnd"/>
+      <w:r>
+        <w:rPr>
+          <w:rFonts w:ascii="Arial" w:hAnsi="Arial" w:cs="Arial"/>
+          <w:b/>
+          <w:bCs/>
+          <w:sz w:val="14"/>
+          <w:szCs w:val="14"/>
+          <w:lang w:val="es-MX"/>
+        </w:rPr>
+        <w:t xml:space="preserve"> }</w:t>
+      </w:r>
+      <w:proofErr w:type="gramEnd"/>
+      <w:r>
+        <w:rPr>
+          <w:rFonts w:ascii="Arial" w:hAnsi="Arial" w:cs="Arial"/>
+          <w:b/>
+          <w:bCs/>
+          <w:sz w:val="14"/>
+          <w:szCs w:val="14"/>
+          <w:lang w:val="es-MX"/>
+        </w:rPr>
+        <w:t>}”</w:t>
       </w:r>
       <w:r>
         <w:rPr>
@@ -2599,6 +2989,7 @@
         </w:rPr>
         <w:t xml:space="preserve">a </w:t>
       </w:r>
+      <w:proofErr w:type="gramStart"/>
       <w:r>
         <w:rPr>
           <w:rFonts w:ascii="Arial" w:hAnsi="Arial" w:cs="Arial"/>
@@ -2607,21 +2998,50 @@
         </w:rPr>
         <w:t xml:space="preserve">{{ </w:t>
       </w:r>
-      <w:r>
-        <w:rPr>
-          <w:rFonts w:ascii="Arial" w:hAnsi="Arial" w:cs="Arial"/>
-          <w:sz w:val="14"/>
-          <w:szCs w:val="14"/>
-        </w:rPr>
-        <w:t>fecha_expedicion</w:t>
-      </w:r>
-      <w:r>
-        <w:rPr>
-          <w:rFonts w:ascii="Arial" w:hAnsi="Arial" w:cs="Arial"/>
-          <w:sz w:val="14"/>
-          <w:szCs w:val="14"/>
-        </w:rPr>
-        <w:t xml:space="preserve"> }}</w:t>
+      <w:proofErr w:type="spellStart"/>
+      <w:r>
+        <w:rPr>
+          <w:rFonts w:ascii="Arial" w:hAnsi="Arial" w:cs="Arial"/>
+          <w:sz w:val="14"/>
+          <w:szCs w:val="14"/>
+        </w:rPr>
+        <w:t>fecha</w:t>
+      </w:r>
+      <w:proofErr w:type="gramEnd"/>
+      <w:r>
+        <w:rPr>
+          <w:rFonts w:ascii="Arial" w:hAnsi="Arial" w:cs="Arial"/>
+          <w:sz w:val="14"/>
+          <w:szCs w:val="14"/>
+        </w:rPr>
+        <w:t>_</w:t>
+      </w:r>
+      <w:proofErr w:type="gramStart"/>
+      <w:r>
+        <w:rPr>
+          <w:rFonts w:ascii="Arial" w:hAnsi="Arial" w:cs="Arial"/>
+          <w:sz w:val="14"/>
+          <w:szCs w:val="14"/>
+        </w:rPr>
+        <w:t>expedicion</w:t>
+      </w:r>
+      <w:proofErr w:type="spellEnd"/>
+      <w:r>
+        <w:rPr>
+          <w:rFonts w:ascii="Arial" w:hAnsi="Arial" w:cs="Arial"/>
+          <w:sz w:val="14"/>
+          <w:szCs w:val="14"/>
+        </w:rPr>
+        <w:t xml:space="preserve"> }</w:t>
+      </w:r>
+      <w:proofErr w:type="gramEnd"/>
+      <w:r>
+        <w:rPr>
+          <w:rFonts w:ascii="Arial" w:hAnsi="Arial" w:cs="Arial"/>
+          <w:sz w:val="14"/>
+          <w:szCs w:val="14"/>
+        </w:rPr>
+        <w:t>}</w:t>
       </w:r>
       <w:r>
         <w:rPr>
@@ -2674,15 +3094,71 @@
         <w:t xml:space="preserve"> </w:t>
       </w:r>
       <w:bookmarkEnd w:id="5"/>
-      <w:r>
-        <w:rPr>
-          <w:rFonts w:ascii="Arial" w:hAnsi="Arial" w:cs="Arial"/>
-          <w:b/>
-          <w:bCs/>
-          <w:sz w:val="14"/>
-          <w:szCs w:val="14"/>
-        </w:rPr>
-        <w:t>{{ numero_carta }}</w:t>
+      <w:proofErr w:type="gramStart"/>
+      <w:r>
+        <w:rPr>
+          <w:rFonts w:ascii="Arial" w:hAnsi="Arial" w:cs="Arial"/>
+          <w:b/>
+          <w:bCs/>
+          <w:sz w:val="14"/>
+          <w:szCs w:val="14"/>
+        </w:rPr>
+        <w:t xml:space="preserve">{{ </w:t>
+      </w:r>
+      <w:proofErr w:type="spellStart"/>
+      <w:r>
+        <w:rPr>
+          <w:rFonts w:ascii="Arial" w:hAnsi="Arial" w:cs="Arial"/>
+          <w:b/>
+          <w:bCs/>
+          <w:sz w:val="14"/>
+          <w:szCs w:val="14"/>
+        </w:rPr>
+        <w:t>numero</w:t>
+      </w:r>
+      <w:proofErr w:type="gramEnd"/>
+      <w:r>
+        <w:rPr>
+          <w:rFonts w:ascii="Arial" w:hAnsi="Arial" w:cs="Arial"/>
+          <w:b/>
+          <w:bCs/>
+          <w:sz w:val="14"/>
+          <w:szCs w:val="14"/>
+        </w:rPr>
+        <w:t>_</w:t>
+      </w:r>
+      <w:proofErr w:type="gramStart"/>
+      <w:r>
+        <w:rPr>
+          <w:rFonts w:ascii="Arial" w:hAnsi="Arial" w:cs="Arial"/>
+          <w:b/>
+          <w:bCs/>
+          <w:sz w:val="14"/>
+          <w:szCs w:val="14"/>
+        </w:rPr>
+        <w:t>carta</w:t>
+      </w:r>
+      <w:proofErr w:type="spellEnd"/>
+      <w:r>
+        <w:rPr>
+          <w:rFonts w:ascii="Arial" w:hAnsi="Arial" w:cs="Arial"/>
+          <w:b/>
+          <w:bCs/>
+          <w:sz w:val="14"/>
+          <w:szCs w:val="14"/>
+        </w:rPr>
+        <w:t xml:space="preserve"> }</w:t>
+      </w:r>
+      <w:proofErr w:type="gramEnd"/>
+      <w:r>
+        <w:rPr>
+          <w:rFonts w:ascii="Arial" w:hAnsi="Arial" w:cs="Arial"/>
+          <w:b/>
+          <w:bCs/>
+          <w:sz w:val="14"/>
+          <w:szCs w:val="14"/>
+        </w:rPr>
+        <w:t>}</w:t>
       </w:r>
       <w:r>
         <w:rPr>
@@ -2840,15 +3316,71 @@
         </w:rPr>
         <w:t xml:space="preserve"> </w:t>
       </w:r>
-      <w:r>
-        <w:rPr>
-          <w:rFonts w:ascii="Arial" w:hAnsi="Arial" w:cs="Arial"/>
-          <w:b/>
-          <w:bCs/>
-          <w:sz w:val="14"/>
-          <w:szCs w:val="14"/>
-        </w:rPr>
-        <w:t>{{ fecha_liquidacion }}</w:t>
+      <w:proofErr w:type="gramStart"/>
+      <w:r>
+        <w:rPr>
+          <w:rFonts w:ascii="Arial" w:hAnsi="Arial" w:cs="Arial"/>
+          <w:b/>
+          <w:bCs/>
+          <w:sz w:val="14"/>
+          <w:szCs w:val="14"/>
+        </w:rPr>
+        <w:t xml:space="preserve">{{ </w:t>
+      </w:r>
+      <w:proofErr w:type="spellStart"/>
+      <w:r>
+        <w:rPr>
+          <w:rFonts w:ascii="Arial" w:hAnsi="Arial" w:cs="Arial"/>
+          <w:b/>
+          <w:bCs/>
+          <w:sz w:val="14"/>
+          <w:szCs w:val="14"/>
+        </w:rPr>
+        <w:t>fecha</w:t>
+      </w:r>
+      <w:proofErr w:type="gramEnd"/>
+      <w:r>
+        <w:rPr>
+          <w:rFonts w:ascii="Arial" w:hAnsi="Arial" w:cs="Arial"/>
+          <w:b/>
+          <w:bCs/>
+          <w:sz w:val="14"/>
+          <w:szCs w:val="14"/>
+        </w:rPr>
+        <w:t>_</w:t>
+      </w:r>
+      <w:proofErr w:type="gramStart"/>
+      <w:r>
+        <w:rPr>
+          <w:rFonts w:ascii="Arial" w:hAnsi="Arial" w:cs="Arial"/>
+          <w:b/>
+          <w:bCs/>
+          <w:sz w:val="14"/>
+          <w:szCs w:val="14"/>
+        </w:rPr>
+        <w:t>liquidacion</w:t>
+      </w:r>
+      <w:proofErr w:type="spellEnd"/>
+      <w:r>
+        <w:rPr>
+          <w:rFonts w:ascii="Arial" w:hAnsi="Arial" w:cs="Arial"/>
+          <w:b/>
+          <w:bCs/>
+          <w:sz w:val="14"/>
+          <w:szCs w:val="14"/>
+        </w:rPr>
+        <w:t xml:space="preserve"> }</w:t>
+      </w:r>
+      <w:proofErr w:type="gramEnd"/>
+      <w:r>
+        <w:rPr>
+          <w:rFonts w:ascii="Arial" w:hAnsi="Arial" w:cs="Arial"/>
+          <w:b/>
+          <w:bCs/>
+          <w:sz w:val="14"/>
+          <w:szCs w:val="14"/>
+        </w:rPr>
+        <w:t>}</w:t>
       </w:r>
     </w:p>
     <w:p>
@@ -3468,6 +4000,7 @@
         </w:rPr>
         <w:t xml:space="preserve"> </w:t>
       </w:r>
+      <w:proofErr w:type="spellStart"/>
       <w:r>
         <w:rPr>
           <w:rFonts w:ascii="Arial" w:hAnsi="Arial" w:cs="Arial"/>
@@ -3476,7 +4009,18 @@
           <w:szCs w:val="14"/>
           <w:lang w:val="es-MX"/>
         </w:rPr>
-        <w:t>numero_credito }}</w:t>
+        <w:t>numero_credito</w:t>
+      </w:r>
+      <w:proofErr w:type="spellEnd"/>
+      <w:r>
+        <w:rPr>
+          <w:rFonts w:ascii="Arial" w:hAnsi="Arial" w:cs="Arial"/>
+          <w:b/>
+          <w:sz w:val="14"/>
+          <w:szCs w:val="14"/>
+          <w:lang w:val="es-MX"/>
+        </w:rPr>
+        <w:t xml:space="preserve"> }}</w:t>
       </w:r>
       <w:r>
         <w:rPr>
@@ -4632,7 +5176,43 @@
           <w:sz w:val="14"/>
           <w:szCs w:val="14"/>
         </w:rPr>
-        <w:t xml:space="preserve"> hija de padres mexicanos, originaria de Ahuazotepec, Estado de Puebla, donde nació el día veintiuno del mes de marzo del año mil novecientos setenta y tres, soltera, Maestra en Derecho, con domicilio en Avenida Barranca del Muerto número doscientos ochenta, colonia Guadalupe Inn, Alcaldía Álvaro Obregón, Ciudad de México, código postal cero mil veinte; con Clave Única de Registro de Población: “HECB730321MPLRRN05” (HECB siete tres cero tres dos uno MPLRRN cero cinco) y Registro Federal de Contribuyentes: “HECB7303211C4” (HECB siete tres cero tres dos uno uno C cuatro).</w:t>
+        <w:t xml:space="preserve"> hija de padres mexicanos, originaria de </w:t>
+      </w:r>
+      <w:proofErr w:type="spellStart"/>
+      <w:r>
+        <w:rPr>
+          <w:rFonts w:ascii="Arial" w:hAnsi="Arial" w:cs="Arial"/>
+          <w:sz w:val="14"/>
+          <w:szCs w:val="14"/>
+        </w:rPr>
+        <w:t>Ahuazotepec</w:t>
+      </w:r>
+      <w:proofErr w:type="spellEnd"/>
+      <w:r>
+        <w:rPr>
+          <w:rFonts w:ascii="Arial" w:hAnsi="Arial" w:cs="Arial"/>
+          <w:sz w:val="14"/>
+          <w:szCs w:val="14"/>
+        </w:rPr>
+        <w:t xml:space="preserve">, Estado de Puebla, donde nació el día veintiuno del mes de marzo del año mil novecientos setenta y tres, soltera, Maestra en Derecho, con domicilio en Avenida Barranca del Muerto número doscientos ochenta, colonia Guadalupe Inn, Alcaldía Álvaro Obregón, Ciudad de México, código postal cero mil veinte; con Clave Única de Registro de Población: “HECB730321MPLRRN05” (HECB siete tres cero tres dos uno MPLRRN cero cinco) y Registro Federal de Contribuyentes: “HECB7303211C4” (HECB siete tres cero tres dos uno </w:t>
+      </w:r>
+      <w:proofErr w:type="spellStart"/>
+      <w:r>
+        <w:rPr>
+          <w:rFonts w:ascii="Arial" w:hAnsi="Arial" w:cs="Arial"/>
+          <w:sz w:val="14"/>
+          <w:szCs w:val="14"/>
+        </w:rPr>
+        <w:t>uno</w:t>
+      </w:r>
+      <w:proofErr w:type="spellEnd"/>
+      <w:r>
+        <w:rPr>
+          <w:rFonts w:ascii="Arial" w:hAnsi="Arial" w:cs="Arial"/>
+          <w:sz w:val="14"/>
+          <w:szCs w:val="14"/>
+        </w:rPr>
+        <w:t xml:space="preserve"> C cuatro).</w:t>
       </w:r>
       <w:r>
         <w:rPr>
@@ -5038,6 +5618,7 @@
         </w:rPr>
         <w:t xml:space="preserve">-------- </w:t>
       </w:r>
+      <w:proofErr w:type="gramStart"/>
       <w:r>
         <w:rPr>
           <w:rFonts w:ascii="Arial" w:eastAsia="MS Mincho" w:hAnsi="Arial" w:cs="Arial"/>
@@ -5045,7 +5626,17 @@
           <w:szCs w:val="14"/>
           <w:lang w:val="es-MX"/>
         </w:rPr>
-        <w:t xml:space="preserve">VI.- Que leí este instrumento a la compareciente, a quien le expliqué su valor, fuerza y las consecuencias legales de su contenido, manifestando su conformidad con el mismo, por lo que lo otorga, ratifica y </w:t>
+        <w:t>VI.-</w:t>
+      </w:r>
+      <w:proofErr w:type="gramEnd"/>
+      <w:r>
+        <w:rPr>
+          <w:rFonts w:ascii="Arial" w:eastAsia="MS Mincho" w:hAnsi="Arial" w:cs="Arial"/>
+          <w:sz w:val="14"/>
+          <w:szCs w:val="14"/>
+          <w:lang w:val="es-MX"/>
+        </w:rPr>
+        <w:t xml:space="preserve"> Que leí este instrumento a la compareciente, a quien le expliqué su valor, fuerza y las consecuencias legales de su contenido, manifestando su conformidad con el mismo, por lo que lo otorga, ratifica y </w:t>
       </w:r>
       <w:r>
         <w:rPr>
@@ -6021,6 +6612,7 @@
         </w:rPr>
         <w:t xml:space="preserve"> </w:t>
       </w:r>
+      <w:proofErr w:type="gramStart"/>
       <w:r>
         <w:rPr>
           <w:rFonts w:ascii="Arial" w:hAnsi="Arial" w:cs="Arial"/>
@@ -6029,7 +6621,62 @@
           <w:szCs w:val="14"/>
           <w:u w:val="single"/>
         </w:rPr>
-        <w:t>{{ nombre_acreditado }}</w:t>
+        <w:t xml:space="preserve">{{ </w:t>
+      </w:r>
+      <w:proofErr w:type="spellStart"/>
+      <w:r>
+        <w:rPr>
+          <w:rFonts w:ascii="Arial" w:hAnsi="Arial" w:cs="Arial"/>
+          <w:b/>
+          <w:sz w:val="14"/>
+          <w:szCs w:val="14"/>
+          <w:u w:val="single"/>
+        </w:rPr>
+        <w:t>nombre</w:t>
+      </w:r>
+      <w:proofErr w:type="gramEnd"/>
+      <w:r>
+        <w:rPr>
+          <w:rFonts w:ascii="Arial" w:hAnsi="Arial" w:cs="Arial"/>
+          <w:b/>
+          <w:sz w:val="14"/>
+          <w:szCs w:val="14"/>
+          <w:u w:val="single"/>
+        </w:rPr>
+        <w:t>_</w:t>
+      </w:r>
+      <w:proofErr w:type="gramStart"/>
+      <w:r>
+        <w:rPr>
+          <w:rFonts w:ascii="Arial" w:hAnsi="Arial" w:cs="Arial"/>
+          <w:b/>
+          <w:sz w:val="14"/>
+          <w:szCs w:val="14"/>
+          <w:u w:val="single"/>
+        </w:rPr>
+        <w:t>acreditado</w:t>
+      </w:r>
+      <w:proofErr w:type="spellEnd"/>
+      <w:r>
+        <w:rPr>
+          <w:rFonts w:ascii="Arial" w:hAnsi="Arial" w:cs="Arial"/>
+          <w:b/>
+          <w:sz w:val="14"/>
+          <w:szCs w:val="14"/>
+          <w:u w:val="single"/>
+        </w:rPr>
+        <w:t xml:space="preserve"> }</w:t>
+      </w:r>
+      <w:proofErr w:type="gramEnd"/>
+      <w:r>
+        <w:rPr>
+          <w:rFonts w:ascii="Arial" w:hAnsi="Arial" w:cs="Arial"/>
+          <w:b/>
+          <w:sz w:val="14"/>
+          <w:szCs w:val="14"/>
+          <w:u w:val="single"/>
+        </w:rPr>
+        <w:t>}</w:t>
       </w:r>
       <w:r>
         <w:rPr>

</xml_diff>